<commit_message>
docs & feat: finalize Phase 2 progress report and synchronize schema, experiments and test suite
</commit_message>
<xml_diff>
--- a/docs/Bao_cao_Tien_do_Dot_2_Nguyen_Thach_Thao.docx
+++ b/docs/Bao_cao_Tien_do_Dot_2_Nguyen_Thach_Thao.docx
@@ -2,93 +2,6 @@
 <file path=word/document.xml><?xml version="1.0" encoding="utf-8"?>
 <w:document xmlns:wpc="http://schemas.microsoft.com/office/word/2010/wordprocessingCanvas" xmlns:cx="http://schemas.microsoft.com/office/drawing/2014/chartex" xmlns:cx1="http://schemas.microsoft.com/office/drawing/2015/9/8/chartex" xmlns:cx2="http://schemas.microsoft.com/office/drawing/2015/10/21/chartex" xmlns:cx3="http://schemas.microsoft.com/office/drawing/2016/5/9/chartex" xmlns:cx4="http://schemas.microsoft.com/office/drawing/2016/5/10/chartex" xmlns:cx5="http://schemas.microsoft.com/office/drawing/2016/5/11/chartex" xmlns:cx6="http://schemas.microsoft.com/office/drawing/2016/5/12/chartex" xmlns:cx7="http://schemas.microsoft.com/office/drawing/2016/5/13/chartex" xmlns:cx8="http://schemas.microsoft.com/office/drawing/2016/5/14/chartex" xmlns:mc="http://schemas.openxmlformats.org/markup-compatibility/2006" xmlns:o="urn:schemas-microsoft-com:office:office" xmlns:r="http://schemas.openxmlformats.org/officeDocument/2006/relationships" xmlns:m="http://schemas.openxmlformats.org/officeDocument/2006/math" xmlns:v="urn:schemas-microsoft-com:vml" xmlns:wp14="http://schemas.microsoft.com/office/word/2010/wordprocessingDrawing" xmlns:wp="http://schemas.openxmlformats.org/drawingml/2006/wordprocessingDrawing" xmlns:w="http://schemas.openxmlformats.org/wordprocessingml/2006/main" xmlns:w14="http://schemas.microsoft.com/office/word/2010/wordml" xmlns:w10="urn:schemas-microsoft-com:office:word" xmlns:w15="http://schemas.microsoft.com/office/word/2012/wordml" xmlns:wpg="http://schemas.microsoft.com/office/word/2010/wordprocessingGroup" xmlns:wpi="http://schemas.microsoft.com/office/word/2010/wordprocessingInk" xmlns:wne="http://schemas.microsoft.com/office/word/2006/wordml" xmlns:wps="http://schemas.microsoft.com/office/word/2010/wordprocessingShape" xmlns:wpsCustomData="http://www.wps.cn/officeDocument/2013/wpsCustomData" mc:Ignorable="w14 w15 wp14">
   <w:body>
-    <w:p>
-      <w:pPr>
-        <w:spacing w:after="40"/>
-        <w:jc w:val="center"/>
-      </w:pPr>
-      <w:r>
-        <w:rPr>
-          <w:rFonts w:ascii="Times New Roman" w:hAnsi="Times New Roman"/>
-          <w:b/>
-          <w:color w:val="2B547E"/>
-          <w:sz w:val="22"/>
-        </w:rPr>
-        <w:t>BỘ GIÁO DỤC VÀ ĐÀO TẠO — TRƯỜNG ĐẠI HỌC ...</w:t>
-      </w:r>
-      <w:r>
-        <w:rPr>
-          <w:rFonts w:ascii="Times New Roman" w:hAnsi="Times New Roman"/>
-          <w:b/>
-          <w:color w:val="2B547E"/>
-          <w:sz w:val="22"/>
-        </w:rPr>
-        <w:br w:type="textWrapping"/>
-      </w:r>
-      <w:r>
-        <w:rPr>
-          <w:rFonts w:ascii="Times New Roman" w:hAnsi="Times New Roman"/>
-          <w:b/>
-          <w:color w:val="2B547E"/>
-          <w:sz w:val="22"/>
-        </w:rPr>
-        <w:t>KHOA HỆ THỐNG THÔNG TIN QUẢN LÝ (MIS)</w:t>
-      </w:r>
-    </w:p>
-    <w:p>
-      <w:pPr>
-        <w:spacing w:after="280"/>
-        <w:jc w:val="center"/>
-      </w:pPr>
-      <w:r>
-        <w:rPr>
-          <w:color w:val="1B365D"/>
-        </w:rPr>
-        <w:t>━━━━━━━ ★ ━━━━━━━</w:t>
-      </w:r>
-    </w:p>
-    <w:p>
-      <w:pPr>
-        <w:spacing w:before="120" w:after="160"/>
-        <w:jc w:val="center"/>
-      </w:pPr>
-      <w:r>
-        <w:rPr>
-          <w:rFonts w:ascii="Times New Roman" w:hAnsi="Times New Roman"/>
-          <w:b/>
-          <w:color w:val="1B365D"/>
-          <w:sz w:val="36"/>
-        </w:rPr>
-        <w:t>BÁO CÁO TIẾN ĐỘ THỰC HIỆN ĐỒ ÁN TỐT NGHIỆP</w:t>
-      </w:r>
-      <w:r>
-        <w:rPr>
-          <w:rFonts w:ascii="Times New Roman" w:hAnsi="Times New Roman"/>
-          <w:b/>
-          <w:color w:val="1B365D"/>
-          <w:sz w:val="36"/>
-        </w:rPr>
-        <w:br w:type="textWrapping"/>
-      </w:r>
-      <w:r>
-        <w:rPr>
-          <w:rFonts w:ascii="Times New Roman" w:hAnsi="Times New Roman"/>
-          <w:b/>
-          <w:color w:val="2B547E"/>
-          <w:sz w:val="26"/>
-        </w:rPr>
-        <w:t>ĐỢT 2: HOÀN THIỆN CSDL, BACKEND, MÔ HÌNH AI &amp; LẬP LỊCH TỐI ƯU TOÀN CỤC</w:t>
-      </w:r>
-      <w:r>
-        <w:rPr>
-          <w:rFonts w:ascii="Times New Roman" w:hAnsi="Times New Roman"/>
-          <w:b/>
-          <w:color w:val="2B547E"/>
-          <w:sz w:val="26"/>
-        </w:rPr>
-        <w:br w:type="textWrapping"/>
-      </w:r>
-    </w:p>
     <w:tbl>
       <w:tblPr>
         <w:tblStyle w:val="12"/>
@@ -137,31 +50,11 @@
         <w:tc>
           <w:tcPr>
             <w:tcW w:w="2880" w:type="dxa"/>
-            <w:shd w:val="clear" w:color="auto" w:fill="F4F6F9"/>
-            <w:tcMar>
-              <w:top w:w="70" w:type="dxa"/>
-              <w:left w:w="120" w:type="dxa"/>
-              <w:bottom w:w="70" w:type="dxa"/>
-              <w:right w:w="100" w:type="dxa"/>
-            </w:tcMar>
-          </w:tcPr>
-          <w:p>
-            <w:pPr>
-              <w:spacing w:after="0"/>
-            </w:pPr>
-            <w:r>
-              <w:rPr>
-                <w:b/>
-                <w:color w:val="1B365D"/>
-                <w:sz w:val="21"/>
-              </w:rPr>
-              <w:t>Tên đề tài:</w:t>
-            </w:r>
-          </w:p>
-        </w:tc>
-        <w:tc>
-          <w:tcPr>
-            <w:tcW w:w="6192" w:type="dxa"/>
+            <w:tcBorders>
+              <w:top w:val="nil"/>
+              <w:bottom w:val="nil"/>
+              <w:tl2br w:val="nil"/>
+            </w:tcBorders>
             <w:shd w:val="clear" w:color="auto" w:fill="FFFFFF"/>
             <w:tcMar>
               <w:top w:w="70" w:type="dxa"/>
@@ -172,65 +65,30 @@
           </w:tcPr>
           <w:p>
             <w:pPr>
-              <w:spacing w:after="0"/>
+              <w:spacing w:after="0" w:line="360" w:lineRule="auto"/>
+              <w:jc w:val="left"/>
+              <w:rPr>
+                <w:b w:val="0"/>
+                <w:color w:val="000000"/>
+              </w:rPr>
             </w:pPr>
             <w:r>
               <w:rPr>
+                <w:b w:val="0"/>
+                <w:color w:val="000000"/>
                 <w:sz w:val="21"/>
               </w:rPr>
-              <w:t>Nghiên cứu và thiết kế hệ thống thông tin quản lý dịch vụ chăm sóc sức khỏe tại nhà tích hợp AI hỗ trợ lập lịch và điều phối nhân sự y tế</w:t>
-            </w:r>
-          </w:p>
-        </w:tc>
-      </w:tr>
-      <w:tr>
-        <w:tblPrEx>
-          <w:tblBorders>
-            <w:top w:val="single" w:color="B0C4DE" w:sz="6" w:space="0"/>
-            <w:left w:val="none" w:color="auto" w:sz="0" w:space="0"/>
-            <w:bottom w:val="single" w:color="B0C4DE" w:sz="6" w:space="0"/>
-            <w:right w:val="none" w:color="auto" w:sz="0" w:space="0"/>
-            <w:insideH w:val="single" w:color="B0C4DE" w:sz="6" w:space="0"/>
-            <w:insideV w:val="none" w:color="auto" w:sz="0" w:space="0"/>
-          </w:tblBorders>
-          <w:tblCellMar>
-            <w:top w:w="0" w:type="dxa"/>
-            <w:left w:w="108" w:type="dxa"/>
-            <w:bottom w:w="0" w:type="dxa"/>
-            <w:right w:w="108" w:type="dxa"/>
-          </w:tblCellMar>
-        </w:tblPrEx>
-        <w:trPr>
-          <w:jc w:val="center"/>
-        </w:trPr>
-        <w:tc>
-          <w:tcPr>
-            <w:tcW w:w="2880" w:type="dxa"/>
-            <w:shd w:val="clear" w:color="auto" w:fill="F4F6F9"/>
-            <w:tcMar>
-              <w:top w:w="70" w:type="dxa"/>
-              <w:left w:w="120" w:type="dxa"/>
-              <w:bottom w:w="70" w:type="dxa"/>
-              <w:right w:w="100" w:type="dxa"/>
-            </w:tcMar>
-          </w:tcPr>
-          <w:p>
-            <w:pPr>
-              <w:spacing w:after="0"/>
-            </w:pPr>
-            <w:r>
-              <w:rPr>
-                <w:b/>
-                <w:color w:val="1B365D"/>
-                <w:sz w:val="21"/>
-              </w:rPr>
-              <w:t>Sinh viên thực hiện:</w:t>
+              <w:t>Mã nguồn &amp; Repository:</w:t>
             </w:r>
           </w:p>
         </w:tc>
         <w:tc>
           <w:tcPr>
             <w:tcW w:w="6192" w:type="dxa"/>
+            <w:tcBorders>
+              <w:top w:val="nil"/>
+              <w:bottom w:val="nil"/>
+            </w:tcBorders>
             <w:shd w:val="clear" w:color="auto" w:fill="FFFFFF"/>
             <w:tcMar>
               <w:top w:w="70" w:type="dxa"/>
@@ -241,153 +99,39 @@
           </w:tcPr>
           <w:p>
             <w:pPr>
-              <w:spacing w:after="0"/>
+              <w:spacing w:after="0" w:line="360" w:lineRule="auto"/>
+              <w:jc w:val="left"/>
+              <w:rPr>
+                <w:b w:val="0"/>
+                <w:color w:val="000000"/>
+                <w:sz w:val="21"/>
+              </w:rPr>
             </w:pPr>
             <w:r>
               <w:rPr>
+                <w:b w:val="0"/>
+                <w:color w:val="000000"/>
                 <w:sz w:val="21"/>
               </w:rPr>
-              <w:t>Nguyễn Thạch Thảo  —  Lớp: 65.TTQL_1 (Chuyên ngành MIS)</w:t>
+              <w:t xml:space="preserve">https://github.com/thachthaok5/home-healthcare-system  </w:t>
             </w:r>
           </w:p>
-        </w:tc>
-      </w:tr>
-      <w:tr>
-        <w:tblPrEx>
-          <w:tblBorders>
-            <w:top w:val="single" w:color="B0C4DE" w:sz="6" w:space="0"/>
-            <w:left w:val="none" w:color="auto" w:sz="0" w:space="0"/>
-            <w:bottom w:val="single" w:color="B0C4DE" w:sz="6" w:space="0"/>
-            <w:right w:val="none" w:color="auto" w:sz="0" w:space="0"/>
-            <w:insideH w:val="single" w:color="B0C4DE" w:sz="6" w:space="0"/>
-            <w:insideV w:val="none" w:color="auto" w:sz="0" w:space="0"/>
-          </w:tblBorders>
-          <w:tblCellMar>
-            <w:top w:w="0" w:type="dxa"/>
-            <w:left w:w="108" w:type="dxa"/>
-            <w:bottom w:w="0" w:type="dxa"/>
-            <w:right w:w="108" w:type="dxa"/>
-          </w:tblCellMar>
-        </w:tblPrEx>
-        <w:trPr>
-          <w:jc w:val="center"/>
-        </w:trPr>
-        <w:tc>
-          <w:tcPr>
-            <w:tcW w:w="2880" w:type="dxa"/>
-            <w:shd w:val="clear" w:color="auto" w:fill="F4F6F9"/>
-            <w:tcMar>
-              <w:top w:w="70" w:type="dxa"/>
-              <w:left w:w="120" w:type="dxa"/>
-              <w:bottom w:w="70" w:type="dxa"/>
-              <w:right w:w="100" w:type="dxa"/>
-            </w:tcMar>
-          </w:tcPr>
           <w:p>
             <w:pPr>
-              <w:spacing w:after="0"/>
+              <w:spacing w:after="0" w:line="360" w:lineRule="auto"/>
+              <w:jc w:val="left"/>
+              <w:rPr>
+                <w:b w:val="0"/>
+                <w:color w:val="000000"/>
+              </w:rPr>
             </w:pPr>
             <w:r>
               <w:rPr>
-                <w:b/>
-                <w:color w:val="1B365D"/>
+                <w:b w:val="0"/>
+                <w:color w:val="000000"/>
                 <w:sz w:val="21"/>
               </w:rPr>
-              <w:t>Kính gửi:</w:t>
-            </w:r>
-          </w:p>
-        </w:tc>
-        <w:tc>
-          <w:tcPr>
-            <w:tcW w:w="6192" w:type="dxa"/>
-            <w:shd w:val="clear" w:color="auto" w:fill="FFFFFF"/>
-            <w:tcMar>
-              <w:top w:w="70" w:type="dxa"/>
-              <w:left w:w="120" w:type="dxa"/>
-              <w:bottom w:w="70" w:type="dxa"/>
-              <w:right w:w="100" w:type="dxa"/>
-            </w:tcMar>
-          </w:tcPr>
-          <w:p>
-            <w:pPr>
-              <w:spacing w:after="0"/>
-            </w:pPr>
-            <w:r>
-              <w:rPr>
-                <w:sz w:val="21"/>
-              </w:rPr>
-              <w:t>Giảng viên Hướng dẫn Đồ án tốt nghiệp</w:t>
-            </w:r>
-          </w:p>
-        </w:tc>
-      </w:tr>
-      <w:tr>
-        <w:tblPrEx>
-          <w:tblBorders>
-            <w:top w:val="single" w:color="B0C4DE" w:sz="6" w:space="0"/>
-            <w:left w:val="none" w:color="auto" w:sz="0" w:space="0"/>
-            <w:bottom w:val="single" w:color="B0C4DE" w:sz="6" w:space="0"/>
-            <w:right w:val="none" w:color="auto" w:sz="0" w:space="0"/>
-            <w:insideH w:val="single" w:color="B0C4DE" w:sz="6" w:space="0"/>
-            <w:insideV w:val="none" w:color="auto" w:sz="0" w:space="0"/>
-          </w:tblBorders>
-          <w:tblCellMar>
-            <w:top w:w="0" w:type="dxa"/>
-            <w:left w:w="108" w:type="dxa"/>
-            <w:bottom w:w="0" w:type="dxa"/>
-            <w:right w:w="108" w:type="dxa"/>
-          </w:tblCellMar>
-        </w:tblPrEx>
-        <w:trPr>
-          <w:jc w:val="center"/>
-        </w:trPr>
-        <w:tc>
-          <w:tcPr>
-            <w:tcW w:w="2880" w:type="dxa"/>
-            <w:shd w:val="clear" w:color="auto" w:fill="F4F6F9"/>
-            <w:tcMar>
-              <w:top w:w="70" w:type="dxa"/>
-              <w:left w:w="120" w:type="dxa"/>
-              <w:bottom w:w="70" w:type="dxa"/>
-              <w:right w:w="100" w:type="dxa"/>
-            </w:tcMar>
-          </w:tcPr>
-          <w:p>
-            <w:pPr>
-              <w:spacing w:after="0"/>
-            </w:pPr>
-            <w:r>
-              <w:rPr>
-                <w:b/>
-                <w:color w:val="1B365D"/>
-                <w:sz w:val="21"/>
-              </w:rPr>
-              <w:t>Mã nguồn &amp; Repository:</w:t>
-            </w:r>
-          </w:p>
-        </w:tc>
-        <w:tc>
-          <w:tcPr>
-            <w:tcW w:w="6192" w:type="dxa"/>
-            <w:shd w:val="clear" w:color="auto" w:fill="FFFFFF"/>
-            <w:tcMar>
-              <w:top w:w="70" w:type="dxa"/>
-              <w:left w:w="120" w:type="dxa"/>
-              <w:bottom w:w="70" w:type="dxa"/>
-              <w:right w:w="100" w:type="dxa"/>
-            </w:tcMar>
-          </w:tcPr>
-          <w:p>
-            <w:pPr>
-              <w:spacing w:after="0"/>
-            </w:pPr>
-            <w:r>
-              <w:rPr>
-                <w:b/>
-                <w:color w:val="0066CC"/>
-                <w:sz w:val="21"/>
-              </w:rPr>
-              <w:t>https://github.com/thachthaok5/home-healthcare-system  (Nhánh: main)</w:t>
+              <w:t>(Nhánh: main)</w:t>
             </w:r>
           </w:p>
         </w:tc>
@@ -395,13 +139,15 @@
     </w:tbl>
     <w:p>
       <w:pPr>
-        <w:spacing w:after="240"/>
+        <w:spacing w:after="240" w:line="360" w:lineRule="auto"/>
+        <w:jc w:val="left"/>
       </w:pPr>
     </w:p>
     <w:p>
       <w:pPr>
         <w:pStyle w:val="2"/>
-        <w:spacing w:before="280" w:after="120"/>
+        <w:spacing w:before="280" w:after="120" w:line="360" w:lineRule="auto"/>
+        <w:jc w:val="left"/>
       </w:pPr>
       <w:r>
         <w:rPr>
@@ -413,7 +159,8 @@
     </w:p>
     <w:p>
       <w:pPr>
-        <w:spacing w:before="120" w:after="80"/>
+        <w:spacing w:before="120" w:after="80" w:line="360" w:lineRule="auto"/>
+        <w:jc w:val="left"/>
       </w:pPr>
       <w:r>
         <w:rPr>
@@ -428,7 +175,7 @@
       <w:tblPr>
         <w:tblStyle w:val="12"/>
         <w:tblW w:w="0" w:type="auto"/>
-        <w:jc w:val="center"/>
+        <w:tblInd w:w="0" w:type="dxa"/>
         <w:tblBorders>
           <w:top w:val="single" w:color="D3D3D3" w:sz="4" w:space="0"/>
           <w:left w:val="none" w:color="auto" w:sz="0" w:space="0"/>
@@ -446,9 +193,9 @@
         </w:tblCellMar>
       </w:tblPr>
       <w:tblGrid>
-        <w:gridCol w:w="2898"/>
-        <w:gridCol w:w="4249"/>
-        <w:gridCol w:w="2715"/>
+        <w:gridCol w:w="2921"/>
+        <w:gridCol w:w="4385"/>
+        <w:gridCol w:w="2556"/>
       </w:tblGrid>
       <w:tr>
         <w:tblPrEx>
@@ -467,9 +214,6 @@
             <w:right w:w="108" w:type="dxa"/>
           </w:tblCellMar>
         </w:tblPrEx>
-        <w:trPr>
-          <w:jc w:val="center"/>
-        </w:trPr>
         <w:tc>
           <w:tcPr>
             <w:tcW w:w="3221" w:type="dxa"/>
@@ -483,14 +227,20 @@
           </w:tcPr>
           <w:p>
             <w:pPr>
-              <w:spacing w:after="0"/>
-              <w:jc w:val="center"/>
+              <w:spacing w:after="0" w:line="360" w:lineRule="auto"/>
+              <w:jc w:val="left"/>
+              <w:rPr>
+                <w:color w:val="auto"/>
+                <w:sz w:val="26"/>
+                <w:szCs w:val="26"/>
+              </w:rPr>
             </w:pPr>
             <w:r>
               <w:rPr>
                 <w:b/>
-                <w:color w:val="FFFFFF"/>
-                <w:sz w:val="20"/>
+                <w:color w:val="auto"/>
+                <w:sz w:val="26"/>
+                <w:szCs w:val="26"/>
               </w:rPr>
               <w:t>Hạng mục GVHD yêu cầu (Mục 5)</w:t>
             </w:r>
@@ -509,14 +259,20 @@
           </w:tcPr>
           <w:p>
             <w:pPr>
-              <w:spacing w:after="0"/>
-              <w:jc w:val="center"/>
+              <w:spacing w:after="0" w:line="360" w:lineRule="auto"/>
+              <w:jc w:val="left"/>
+              <w:rPr>
+                <w:color w:val="auto"/>
+                <w:sz w:val="26"/>
+                <w:szCs w:val="26"/>
+              </w:rPr>
             </w:pPr>
             <w:r>
               <w:rPr>
                 <w:b/>
-                <w:color w:val="FFFFFF"/>
-                <w:sz w:val="20"/>
+                <w:color w:val="auto"/>
+                <w:sz w:val="26"/>
+                <w:szCs w:val="26"/>
               </w:rPr>
               <w:t>Hiện trạng hoàn thành trong Source Code</w:t>
             </w:r>
@@ -535,14 +291,20 @@
           </w:tcPr>
           <w:p>
             <w:pPr>
-              <w:spacing w:after="0"/>
-              <w:jc w:val="center"/>
+              <w:spacing w:after="0" w:line="360" w:lineRule="auto"/>
+              <w:jc w:val="left"/>
+              <w:rPr>
+                <w:color w:val="auto"/>
+                <w:sz w:val="26"/>
+                <w:szCs w:val="26"/>
+              </w:rPr>
             </w:pPr>
             <w:r>
               <w:rPr>
                 <w:b/>
-                <w:color w:val="FFFFFF"/>
-                <w:sz w:val="20"/>
+                <w:color w:val="auto"/>
+                <w:sz w:val="26"/>
+                <w:szCs w:val="26"/>
               </w:rPr>
               <w:t>Trạng thái</w:t>
             </w:r>
@@ -566,9 +328,6 @@
             <w:right w:w="108" w:type="dxa"/>
           </w:tblCellMar>
         </w:tblPrEx>
-        <w:trPr>
-          <w:jc w:val="center"/>
-        </w:trPr>
         <w:tc>
           <w:tcPr>
             <w:tcW w:w="3168" w:type="dxa"/>
@@ -581,13 +340,20 @@
           </w:tcPr>
           <w:p>
             <w:pPr>
-              <w:spacing w:after="0"/>
+              <w:spacing w:after="0" w:line="360" w:lineRule="auto"/>
+              <w:jc w:val="left"/>
+              <w:rPr>
+                <w:color w:val="auto"/>
+                <w:sz w:val="26"/>
+                <w:szCs w:val="26"/>
+              </w:rPr>
             </w:pPr>
             <w:r>
               <w:rPr>
                 <w:b/>
-                <w:color w:val="2B547E"/>
-                <w:sz w:val="19"/>
+                <w:color w:val="auto"/>
+                <w:sz w:val="26"/>
+                <w:szCs w:val="26"/>
               </w:rPr>
               <w:t>1. ERD v2.1 và Data Dictionary v2.1 đồng bộ 1–1</w:t>
             </w:r>
@@ -605,11 +371,19 @@
           </w:tcPr>
           <w:p>
             <w:pPr>
-              <w:spacing w:after="0"/>
+              <w:spacing w:after="0" w:line="360" w:lineRule="auto"/>
+              <w:jc w:val="left"/>
+              <w:rPr>
+                <w:color w:val="auto"/>
+                <w:sz w:val="26"/>
+                <w:szCs w:val="26"/>
+              </w:rPr>
             </w:pPr>
             <w:r>
               <w:rPr>
-                <w:sz w:val="19"/>
+                <w:color w:val="auto"/>
+                <w:sz w:val="26"/>
+                <w:szCs w:val="26"/>
               </w:rPr>
               <w:t>Đã chuẩn hóa hoàn tất 23 bảng quan hệ, đồng bộ 100% tên cột (snake_case), kiểu dữ liệu PostgreSQL, ràng buộc khóa ngoại và index.</w:t>
             </w:r>
@@ -627,14 +401,20 @@
           </w:tcPr>
           <w:p>
             <w:pPr>
-              <w:spacing w:after="0"/>
-              <w:jc w:val="center"/>
+              <w:spacing w:after="0" w:line="360" w:lineRule="auto"/>
+              <w:jc w:val="left"/>
+              <w:rPr>
+                <w:color w:val="auto"/>
+                <w:sz w:val="26"/>
+                <w:szCs w:val="26"/>
+              </w:rPr>
             </w:pPr>
             <w:r>
               <w:rPr>
                 <w:b/>
-                <w:color w:val="008000"/>
-                <w:sz w:val="19"/>
+                <w:color w:val="auto"/>
+                <w:sz w:val="26"/>
+                <w:szCs w:val="26"/>
               </w:rPr>
               <w:t>Hoàn thành 100%</w:t>
             </w:r>
@@ -658,9 +438,6 @@
             <w:right w:w="108" w:type="dxa"/>
           </w:tblCellMar>
         </w:tblPrEx>
-        <w:trPr>
-          <w:jc w:val="center"/>
-        </w:trPr>
         <w:tc>
           <w:tcPr>
             <w:tcW w:w="3168" w:type="dxa"/>
@@ -674,13 +451,20 @@
           </w:tcPr>
           <w:p>
             <w:pPr>
-              <w:spacing w:after="0"/>
+              <w:spacing w:after="0" w:line="360" w:lineRule="auto"/>
+              <w:jc w:val="left"/>
+              <w:rPr>
+                <w:color w:val="auto"/>
+                <w:sz w:val="26"/>
+                <w:szCs w:val="26"/>
+              </w:rPr>
             </w:pPr>
             <w:r>
               <w:rPr>
                 <w:b/>
-                <w:color w:val="2B547E"/>
-                <w:sz w:val="19"/>
+                <w:color w:val="auto"/>
+                <w:sz w:val="26"/>
+                <w:szCs w:val="26"/>
               </w:rPr>
               <w:t>2. PostgreSQL database tạo bằng migration/schema</w:t>
             </w:r>
@@ -699,11 +483,19 @@
           </w:tcPr>
           <w:p>
             <w:pPr>
-              <w:spacing w:after="0"/>
+              <w:spacing w:after="0" w:line="360" w:lineRule="auto"/>
+              <w:jc w:val="left"/>
+              <w:rPr>
+                <w:color w:val="auto"/>
+                <w:sz w:val="26"/>
+                <w:szCs w:val="26"/>
+              </w:rPr>
             </w:pPr>
             <w:r>
               <w:rPr>
-                <w:sz w:val="19"/>
+                <w:color w:val="auto"/>
+                <w:sz w:val="26"/>
+                <w:szCs w:val="26"/>
               </w:rPr>
               <w:t>PostgreSQL 18 trên cổng 5432 (home_healthcare_db), cấu hình Alembic migration tự động sinh và quản lý phiên bản bảng mượt mà.</w:t>
             </w:r>
@@ -722,14 +514,20 @@
           </w:tcPr>
           <w:p>
             <w:pPr>
-              <w:spacing w:after="0"/>
-              <w:jc w:val="center"/>
+              <w:spacing w:after="0" w:line="360" w:lineRule="auto"/>
+              <w:jc w:val="left"/>
+              <w:rPr>
+                <w:color w:val="auto"/>
+                <w:sz w:val="26"/>
+                <w:szCs w:val="26"/>
+              </w:rPr>
             </w:pPr>
             <w:r>
               <w:rPr>
                 <w:b/>
-                <w:color w:val="008000"/>
-                <w:sz w:val="19"/>
+                <w:color w:val="auto"/>
+                <w:sz w:val="26"/>
+                <w:szCs w:val="26"/>
               </w:rPr>
               <w:t>Hoàn thành 100%</w:t>
             </w:r>
@@ -753,9 +551,6 @@
             <w:right w:w="108" w:type="dxa"/>
           </w:tblCellMar>
         </w:tblPrEx>
-        <w:trPr>
-          <w:jc w:val="center"/>
-        </w:trPr>
         <w:tc>
           <w:tcPr>
             <w:tcW w:w="3168" w:type="dxa"/>
@@ -768,13 +563,20 @@
           </w:tcPr>
           <w:p>
             <w:pPr>
-              <w:spacing w:after="0"/>
+              <w:spacing w:after="0" w:line="360" w:lineRule="auto"/>
+              <w:jc w:val="left"/>
+              <w:rPr>
+                <w:color w:val="auto"/>
+                <w:sz w:val="26"/>
+                <w:szCs w:val="26"/>
+              </w:rPr>
             </w:pPr>
             <w:r>
               <w:rPr>
                 <w:b/>
-                <w:color w:val="2B547E"/>
-                <w:sz w:val="19"/>
+                <w:color w:val="auto"/>
+                <w:sz w:val="26"/>
+                <w:szCs w:val="26"/>
               </w:rPr>
               <w:t>3. seed_database.py &amp; dữ liệu synthetic chạy được</w:t>
             </w:r>
@@ -792,11 +594,19 @@
           </w:tcPr>
           <w:p>
             <w:pPr>
-              <w:spacing w:after="0"/>
+              <w:spacing w:after="0" w:line="360" w:lineRule="auto"/>
+              <w:jc w:val="left"/>
+              <w:rPr>
+                <w:color w:val="auto"/>
+                <w:sz w:val="26"/>
+                <w:szCs w:val="26"/>
+              </w:rPr>
             </w:pPr>
             <w:r>
               <w:rPr>
-                <w:sz w:val="19"/>
+                <w:color w:val="auto"/>
+                <w:sz w:val="26"/>
+                <w:szCs w:val="26"/>
               </w:rPr>
               <w:t>Script seed dữ liệu tự động, có tính idempotent (chạy lại an toàn), sinh đầy đủ admin, nhân viên, kỹ năng, dịch vụ, ca khám tại TP. Nha Trang.</w:t>
             </w:r>
@@ -814,14 +624,20 @@
           </w:tcPr>
           <w:p>
             <w:pPr>
-              <w:spacing w:after="0"/>
-              <w:jc w:val="center"/>
+              <w:spacing w:after="0" w:line="360" w:lineRule="auto"/>
+              <w:jc w:val="left"/>
+              <w:rPr>
+                <w:color w:val="auto"/>
+                <w:sz w:val="26"/>
+                <w:szCs w:val="26"/>
+              </w:rPr>
             </w:pPr>
             <w:r>
               <w:rPr>
                 <w:b/>
-                <w:color w:val="008000"/>
-                <w:sz w:val="19"/>
+                <w:color w:val="auto"/>
+                <w:sz w:val="26"/>
+                <w:szCs w:val="26"/>
               </w:rPr>
               <w:t>Hoàn thành 100%</w:t>
             </w:r>
@@ -845,9 +661,6 @@
             <w:right w:w="108" w:type="dxa"/>
           </w:tblCellMar>
         </w:tblPrEx>
-        <w:trPr>
-          <w:jc w:val="center"/>
-        </w:trPr>
         <w:tc>
           <w:tcPr>
             <w:tcW w:w="3168" w:type="dxa"/>
@@ -861,13 +674,20 @@
           </w:tcPr>
           <w:p>
             <w:pPr>
-              <w:spacing w:after="0"/>
+              <w:spacing w:after="0" w:line="360" w:lineRule="auto"/>
+              <w:jc w:val="left"/>
+              <w:rPr>
+                <w:color w:val="auto"/>
+                <w:sz w:val="26"/>
+                <w:szCs w:val="26"/>
+              </w:rPr>
             </w:pPr>
             <w:r>
               <w:rPr>
                 <w:b/>
-                <w:color w:val="2B547E"/>
-                <w:sz w:val="19"/>
+                <w:color w:val="auto"/>
+                <w:sz w:val="26"/>
+                <w:szCs w:val="26"/>
               </w:rPr>
               <w:t>4. Backend cơ bản (Auth, Customer, Staff, Booking...)</w:t>
             </w:r>
@@ -886,11 +706,19 @@
           </w:tcPr>
           <w:p>
             <w:pPr>
-              <w:spacing w:after="0"/>
+              <w:spacing w:after="0" w:line="360" w:lineRule="auto"/>
+              <w:jc w:val="left"/>
+              <w:rPr>
+                <w:color w:val="auto"/>
+                <w:sz w:val="26"/>
+                <w:szCs w:val="26"/>
+              </w:rPr>
             </w:pPr>
             <w:r>
               <w:rPr>
-                <w:sz w:val="19"/>
+                <w:color w:val="auto"/>
+                <w:sz w:val="26"/>
+                <w:szCs w:val="26"/>
               </w:rPr>
               <w:t>FastAPI, kiến trúc module phân tầng, xác thực JWT + RBAC 3 vai trò, chuyển đổi 100% sang Pydantic v2 ConfigDict(from_attributes=True).</w:t>
             </w:r>
@@ -909,14 +737,20 @@
           </w:tcPr>
           <w:p>
             <w:pPr>
-              <w:spacing w:after="0"/>
-              <w:jc w:val="center"/>
+              <w:spacing w:after="0" w:line="360" w:lineRule="auto"/>
+              <w:jc w:val="left"/>
+              <w:rPr>
+                <w:color w:val="auto"/>
+                <w:sz w:val="26"/>
+                <w:szCs w:val="26"/>
+              </w:rPr>
             </w:pPr>
             <w:r>
               <w:rPr>
                 <w:b/>
-                <w:color w:val="008000"/>
-                <w:sz w:val="19"/>
+                <w:color w:val="auto"/>
+                <w:sz w:val="26"/>
+                <w:szCs w:val="26"/>
               </w:rPr>
               <w:t>Hoàn thành 100%</w:t>
             </w:r>
@@ -940,9 +774,6 @@
             <w:right w:w="108" w:type="dxa"/>
           </w:tblCellMar>
         </w:tblPrEx>
-        <w:trPr>
-          <w:jc w:val="center"/>
-        </w:trPr>
         <w:tc>
           <w:tcPr>
             <w:tcW w:w="3168" w:type="dxa"/>
@@ -955,13 +786,20 @@
           </w:tcPr>
           <w:p>
             <w:pPr>
-              <w:spacing w:after="0"/>
+              <w:spacing w:after="0" w:line="360" w:lineRule="auto"/>
+              <w:jc w:val="left"/>
+              <w:rPr>
+                <w:color w:val="auto"/>
+                <w:sz w:val="26"/>
+                <w:szCs w:val="26"/>
+              </w:rPr>
             </w:pPr>
             <w:r>
               <w:rPr>
                 <w:b/>
-                <w:color w:val="2B547E"/>
-                <w:sz w:val="19"/>
+                <w:color w:val="auto"/>
+                <w:sz w:val="26"/>
+                <w:szCs w:val="26"/>
               </w:rPr>
               <w:t>5. README hướng dẫn cài đặt và chạy chương trình</w:t>
             </w:r>
@@ -979,13 +817,21 @@
           </w:tcPr>
           <w:p>
             <w:pPr>
-              <w:spacing w:after="0"/>
+              <w:spacing w:after="0" w:line="360" w:lineRule="auto"/>
+              <w:jc w:val="left"/>
+              <w:rPr>
+                <w:color w:val="auto"/>
+                <w:sz w:val="26"/>
+                <w:szCs w:val="26"/>
+              </w:rPr>
             </w:pPr>
             <w:r>
               <w:rPr>
-                <w:sz w:val="19"/>
-              </w:rPr>
-              <w:t>Tài liệu README.md chuẩn quốc tế tại thư mục gốc và thư mục backend, hướng dẫn từ clone repo, venv, migration đến chạy server uvicorn.</w:t>
+                <w:color w:val="auto"/>
+                <w:sz w:val="26"/>
+                <w:szCs w:val="26"/>
+              </w:rPr>
+              <w:t>Tài liệu README.md tại thư mục gốc và thư mục backend, hướng dẫn từ clone repo, venv, migration đến chạy server uvicorn.</w:t>
             </w:r>
           </w:p>
         </w:tc>
@@ -1001,14 +847,20 @@
           </w:tcPr>
           <w:p>
             <w:pPr>
-              <w:spacing w:after="0"/>
-              <w:jc w:val="center"/>
+              <w:spacing w:after="0" w:line="360" w:lineRule="auto"/>
+              <w:jc w:val="left"/>
+              <w:rPr>
+                <w:color w:val="auto"/>
+                <w:sz w:val="26"/>
+                <w:szCs w:val="26"/>
+              </w:rPr>
             </w:pPr>
             <w:r>
               <w:rPr>
                 <w:b/>
-                <w:color w:val="008000"/>
-                <w:sz w:val="19"/>
+                <w:color w:val="auto"/>
+                <w:sz w:val="26"/>
+                <w:szCs w:val="26"/>
               </w:rPr>
               <w:t>Hoàn thành 100%</w:t>
             </w:r>
@@ -1032,9 +884,6 @@
             <w:right w:w="108" w:type="dxa"/>
           </w:tblCellMar>
         </w:tblPrEx>
-        <w:trPr>
-          <w:jc w:val="center"/>
-        </w:trPr>
         <w:tc>
           <w:tcPr>
             <w:tcW w:w="3168" w:type="dxa"/>
@@ -1048,13 +897,20 @@
           </w:tcPr>
           <w:p>
             <w:pPr>
-              <w:spacing w:after="0"/>
+              <w:spacing w:after="0" w:line="360" w:lineRule="auto"/>
+              <w:jc w:val="left"/>
+              <w:rPr>
+                <w:color w:val="auto"/>
+                <w:sz w:val="26"/>
+                <w:szCs w:val="26"/>
+              </w:rPr>
             </w:pPr>
             <w:r>
               <w:rPr>
                 <w:b/>
-                <w:color w:val="2B547E"/>
-                <w:sz w:val="19"/>
+                <w:color w:val="auto"/>
+                <w:sz w:val="26"/>
+                <w:szCs w:val="26"/>
               </w:rPr>
               <w:t>6. Unit tests ràng buộc &amp; chuyển đổi trạng thái</w:t>
             </w:r>
@@ -1073,11 +929,19 @@
           </w:tcPr>
           <w:p>
             <w:pPr>
-              <w:spacing w:after="0"/>
+              <w:spacing w:after="0" w:line="360" w:lineRule="auto"/>
+              <w:jc w:val="left"/>
+              <w:rPr>
+                <w:color w:val="auto"/>
+                <w:sz w:val="26"/>
+                <w:szCs w:val="26"/>
+              </w:rPr>
             </w:pPr>
             <w:r>
               <w:rPr>
-                <w:sz w:val="19"/>
+                <w:color w:val="auto"/>
+                <w:sz w:val="26"/>
+                <w:szCs w:val="26"/>
               </w:rPr>
               <w:t>Đã viết 24 bài kiểm thử tự động trên pytest phủ kín 6 Hard Constraints, DSS Scoring, State Machine, Auth và AI Model (100% Passed).</w:t>
             </w:r>
@@ -1096,14 +960,20 @@
           </w:tcPr>
           <w:p>
             <w:pPr>
-              <w:spacing w:after="0"/>
-              <w:jc w:val="center"/>
+              <w:spacing w:after="0" w:line="360" w:lineRule="auto"/>
+              <w:jc w:val="left"/>
+              <w:rPr>
+                <w:color w:val="auto"/>
+                <w:sz w:val="26"/>
+                <w:szCs w:val="26"/>
+              </w:rPr>
             </w:pPr>
             <w:r>
               <w:rPr>
                 <w:b/>
-                <w:color w:val="008000"/>
-                <w:sz w:val="19"/>
+                <w:color w:val="auto"/>
+                <w:sz w:val="26"/>
+                <w:szCs w:val="26"/>
               </w:rPr>
               <w:t>Hoàn thành 100%</w:t>
             </w:r>
@@ -1127,9 +997,6 @@
             <w:right w:w="108" w:type="dxa"/>
           </w:tblCellMar>
         </w:tblPrEx>
-        <w:trPr>
-          <w:jc w:val="center"/>
-        </w:trPr>
         <w:tc>
           <w:tcPr>
             <w:tcW w:w="3168" w:type="dxa"/>
@@ -1142,13 +1009,20 @@
           </w:tcPr>
           <w:p>
             <w:pPr>
-              <w:spacing w:after="0"/>
+              <w:spacing w:after="0" w:line="360" w:lineRule="auto"/>
+              <w:jc w:val="left"/>
+              <w:rPr>
+                <w:color w:val="auto"/>
+                <w:sz w:val="26"/>
+                <w:szCs w:val="26"/>
+              </w:rPr>
             </w:pPr>
             <w:r>
               <w:rPr>
                 <w:b/>
-                <w:color w:val="2B547E"/>
-                <w:sz w:val="19"/>
+                <w:color w:val="auto"/>
+                <w:sz w:val="26"/>
+                <w:szCs w:val="26"/>
               </w:rPr>
               <w:t>7. Dataset ML v1, model baseline và bảng kết quả</w:t>
             </w:r>
@@ -1166,11 +1040,19 @@
           </w:tcPr>
           <w:p>
             <w:pPr>
-              <w:spacing w:after="0"/>
+              <w:spacing w:after="0" w:line="360" w:lineRule="auto"/>
+              <w:jc w:val="left"/>
+              <w:rPr>
+                <w:color w:val="auto"/>
+                <w:sz w:val="26"/>
+                <w:szCs w:val="26"/>
+              </w:rPr>
             </w:pPr>
             <w:r>
               <w:rPr>
-                <w:sz w:val="19"/>
+                <w:color w:val="auto"/>
+                <w:sz w:val="26"/>
+                <w:szCs w:val="26"/>
               </w:rPr>
               <w:t>Tập 800 mẫu Nha Trang, No Leakage. Thử nghiệm 5 thuật toán: HistGradientBoosting đạt R²=0.920, MAE 4.43p. Đầy đủ Benchmark &amp; Ablation Study.</w:t>
             </w:r>
@@ -1188,16 +1070,35 @@
           </w:tcPr>
           <w:p>
             <w:pPr>
-              <w:spacing w:after="0"/>
-              <w:jc w:val="center"/>
+              <w:spacing w:after="0" w:line="360" w:lineRule="auto"/>
+              <w:jc w:val="left"/>
+              <w:rPr>
+                <w:rFonts w:hint="default"/>
+                <w:color w:val="auto"/>
+                <w:sz w:val="26"/>
+                <w:szCs w:val="26"/>
+                <w:lang w:val="en-US"/>
+              </w:rPr>
             </w:pPr>
             <w:r>
               <w:rPr>
                 <w:b/>
-                <w:color w:val="008000"/>
-                <w:sz w:val="19"/>
-              </w:rPr>
-              <w:t>Hoàn thành 100% (Vượt mức)</w:t>
+                <w:color w:val="auto"/>
+                <w:sz w:val="26"/>
+                <w:szCs w:val="26"/>
+              </w:rPr>
+              <w:t xml:space="preserve">Hoàn thành 100% </w:t>
+            </w:r>
+            <w:r>
+              <w:rPr>
+                <w:rFonts w:hint="default"/>
+                <w:b/>
+                <w:color w:val="auto"/>
+                <w:sz w:val="26"/>
+                <w:szCs w:val="26"/>
+                <w:lang w:val="en-US"/>
+              </w:rPr>
+              <w:t>a</w:t>
             </w:r>
           </w:p>
         </w:tc>
@@ -1205,28 +1106,29 @@
     </w:tbl>
     <w:p>
       <w:pPr>
-        <w:spacing w:after="200"/>
+        <w:spacing w:after="200" w:line="360" w:lineRule="auto"/>
+        <w:jc w:val="left"/>
       </w:pPr>
     </w:p>
     <w:p>
       <w:pPr>
         <w:pStyle w:val="2"/>
-        <w:spacing w:before="280" w:after="120"/>
+        <w:spacing w:before="280" w:after="120" w:line="360" w:lineRule="auto"/>
+        <w:jc w:val="left"/>
       </w:pPr>
       <w:r>
         <w:rPr>
           <w:rFonts w:ascii="Times New Roman" w:hAnsi="Times New Roman"/>
           <w:color w:val="1B365D"/>
         </w:rPr>
-        <w:t>II. BÁO CÁO 5 NỘI DUNG TRỌNG TÂM THEO QUY ĐỊNH CỦA GVHD (MỤC 6)</w:t>
+        <w:t xml:space="preserve">II. BÁO CÁO 5 NỘI DUNG TRỌNG TÂM </w:t>
       </w:r>
-      <w:bookmarkStart w:id="0" w:name="_GoBack"/>
-      <w:bookmarkEnd w:id="0"/>
     </w:p>
     <w:p>
       <w:pPr>
         <w:pStyle w:val="3"/>
-        <w:spacing w:before="160" w:after="80"/>
+        <w:spacing w:before="160" w:after="80" w:line="360" w:lineRule="auto"/>
+        <w:jc w:val="left"/>
       </w:pPr>
       <w:r>
         <w:rPr>
@@ -1237,50 +1139,109 @@
       </w:r>
     </w:p>
     <w:p>
+      <w:pPr>
+        <w:spacing w:line="360" w:lineRule="auto"/>
+        <w:jc w:val="left"/>
+      </w:pPr>
       <w:r>
-        <w:t>Kể từ khi nhận được tài liệu hướng dẫn Đợt 2 của Cô, em đã tập trung triển khai tuần tự theo đúng 6 giai đoạn (A → F):</w:t>
+        <w:t xml:space="preserve">• </w:t>
+      </w:r>
+      <w:r>
+        <w:rPr>
+          <w:b/>
+          <w:bCs/>
+        </w:rPr>
+        <w:t xml:space="preserve">Giai đoạn A (Cơ sở dữ liệu v2.1): </w:t>
+      </w:r>
+      <w:r>
+        <w:t>Khắc phục triệt để các tồn tại về cấu trúc dữ liệu theo góp ý của Cô. Đã chốt 23 bảng quan hệ, chuẩn hóa quy ước đặt tên (snake_case: status_outcome, latitude/longitude, skill_level, is_active), tạo migration Alembic và script seed CSDL.</w:t>
       </w:r>
       <w:r>
         <w:br w:type="textWrapping"/>
       </w:r>
       <w:r>
-        <w:t>• Giai đoạn A (Cơ sở dữ liệu v2.1): Khắc phục triệt để các tồn tại về cấu trúc dữ liệu theo góp ý của Cô. Đã chốt 23 bảng quan hệ, chuẩn hóa quy ước đặt tên (snake_case: status_outcome, latitude/longitude, skill_level, is_active), tạo migration Alembic và script seed CSDL.</w:t>
+        <w:t>•</w:t>
+      </w:r>
+      <w:r>
+        <w:rPr>
+          <w:b/>
+          <w:bCs/>
+        </w:rPr>
+        <w:t xml:space="preserve"> Giai đoạn B (Backend Core &amp; Security): </w:t>
+      </w:r>
+      <w:r>
+        <w:t>Chuẩn hóa schemas sang Pydantic v2 (ConfigDict), thiết lập phân quyền RBAC 3 vai trò (Admin, Coordinator, Medical Staff), bảo đảm tính cô lập dữ liệu (Test Isolation) giúp lệnh pytest có thể chạy lặp lại vô hạn lần.</w:t>
       </w:r>
       <w:r>
         <w:br w:type="textWrapping"/>
       </w:r>
       <w:r>
-        <w:t>• Giai đoạn B (Backend Core &amp; Security): Chuẩn hóa schemas sang Pydantic v2 (ConfigDict), thiết lập phân quyền RBAC 3 vai trò (Admin, Coordinator, Medical Staff), bảo đảm tính cô lập dữ liệu (Test Isolation) giúp lệnh pytest có thể chạy lặp lại vô hạn lần.</w:t>
+        <w:t>•</w:t>
+      </w:r>
+      <w:r>
+        <w:rPr>
+          <w:b/>
+          <w:bCs/>
+        </w:rPr>
+        <w:t xml:space="preserve"> Giai đoạn C (Dataset Machine Learning):</w:t>
+      </w:r>
+      <w:r>
+        <w:t xml:space="preserve"> Viết script truy vấn CSDL để trích xuất tập dữ liệu 800 mẫu tại Nha Trang. Tuân thủ tuyệt đối nguyên tắc Không rò rỉ dữ liệu (No Data Leakage), chỉ dùng 8 đặc trưng đã biết trước khi lập lịch. Chia tập Train/Val/Test theo tỷ lệ 70/15/15.</w:t>
       </w:r>
       <w:r>
         <w:br w:type="textWrapping"/>
       </w:r>
       <w:r>
-        <w:t>• Giai đoạn C (Dataset Machine Learning): Viết script truy vấn CSDL để trích xuất tập dữ liệu 800 mẫu tại Nha Trang. Tuân thủ tuyệt đối nguyên tắc Không rò rỉ dữ liệu (No Data Leakage), chỉ dùng 8 đặc trưng đã biết trước khi lập lịch. Chia tập Train/Val/Test theo tỷ lệ 70/15/15.</w:t>
+        <w:t>•</w:t>
+      </w:r>
+      <w:r>
+        <w:rPr>
+          <w:b/>
+          <w:bCs/>
+        </w:rPr>
+        <w:t xml:space="preserve"> Giai đoạn D (Mô hình AI dự đoán thời lượng):</w:t>
+      </w:r>
+      <w:r>
+        <w:t xml:space="preserve"> Đã huấn luyện và thực nghiệm đối sánh 5 mô hình theo đề cương MIS. Lựa chọn HistGradientBoostingRegressor là mô hình tối ưu (MAE 4.43 phút, R² = 0.920, giảm 67.1% sai số). Đã xuất file artifact duration_model_v1.joblib, đăng ký metadata vào bảng ai_model_versions và cài đặt cơ chế Safe Fallback.</w:t>
       </w:r>
       <w:r>
         <w:br w:type="textWrapping"/>
       </w:r>
       <w:r>
-        <w:t>• Giai đoạn D (Mô hình AI dự đoán thời lượng): Đã huấn luyện và thực nghiệm đối sánh 5 mô hình theo đề cương MIS. Lựa chọn HistGradientBoostingRegressor là mô hình tối ưu (MAE 4.43 phút, R² = 0.920, giảm 67.1% sai số). Đã xuất file artifact duration_model_v1.joblib, đăng ký metadata vào bảng ai_model_versions và cài đặt cơ chế Safe Fallback.</w:t>
+        <w:t xml:space="preserve">• </w:t>
+      </w:r>
+      <w:r>
+        <w:rPr>
+          <w:b/>
+          <w:bCs/>
+        </w:rPr>
+        <w:t xml:space="preserve">Giai đoạn E (Bộ máy Lập lịch &amp; Ra quyết định DSS): </w:t>
+      </w:r>
+      <w:r>
+        <w:t>Cài đặt động cơ kiểm tra 6 Ràng buộc cứng (Hard Constraints), thuật toán chấm điểm đa tiêu chí DSS (5 trọng số) và mô hình tối ưu hóa toàn cục Google OR-Tools CP-SAT.</w:t>
       </w:r>
       <w:r>
         <w:br w:type="textWrapping"/>
       </w:r>
       <w:r>
-        <w:t>• Giai đoạn E (Bộ máy Lập lịch &amp; Ra quyết định DSS): Cài đặt động cơ kiểm tra 6 Ràng buộc cứng (Hard Constraints), thuật toán chấm điểm đa tiêu chí DSS (5 trọng số) và mô hình tối ưu hóa toàn cục Google OR-Tools CP-SAT.</w:t>
+        <w:t>•</w:t>
       </w:r>
       <w:r>
-        <w:br w:type="textWrapping"/>
+        <w:rPr>
+          <w:b/>
+          <w:bCs/>
+        </w:rPr>
+        <w:t xml:space="preserve"> Giai đoạn F (Chuỗi nghiệp vụ khép kín &amp; Thực nghiệm):</w:t>
       </w:r>
       <w:r>
-        <w:t>• Giai đoạn F (Chuỗi nghiệp vụ khép kín &amp; Thực nghiệm): Xây dựng test suite kiểm thử luồng 8 bước End-to-End từ Tiếp nhận → AI dự đoán → Phân công OR-Tools → Điều phối viên duyệt → Thực thi → Đánh giá. Chạy thực nghiệm Benchmark 4 thuật toán và Thí nghiệm bóc tách Ablation Study bắt buộc.</w:t>
+        <w:t xml:space="preserve"> Xây dựng test suite kiểm thử luồng 8 bước End-to-End từ Tiếp nhận → AI dự đoán → Phân công OR-Tools → Điều phối viên duyệt → Thực thi → Đánh giá. Chạy thực nghiệm Benchmark 4 thuật toán và Thí nghiệm bóc tách Ablation Study bắt buộc.</w:t>
       </w:r>
     </w:p>
     <w:p>
       <w:pPr>
         <w:pStyle w:val="3"/>
-        <w:spacing w:before="160" w:after="80"/>
+        <w:spacing w:before="160" w:after="80" w:line="360" w:lineRule="auto"/>
+        <w:jc w:val="left"/>
       </w:pPr>
       <w:r>
         <w:rPr>
@@ -1291,6 +1252,10 @@
       </w:r>
     </w:p>
     <w:p>
+      <w:pPr>
+        <w:spacing w:line="360" w:lineRule="auto"/>
+        <w:jc w:val="left"/>
+      </w:pPr>
       <w:r>
         <w:t>Dưới đây là bảng tổng hợp các thành phần mã nguồn cốt lõi trong dự án:</w:t>
       </w:r>
@@ -1331,6 +1296,12 @@
             <w:insideH w:val="single" w:color="D3D3D3" w:sz="4" w:space="0"/>
             <w:insideV w:val="none" w:color="auto" w:sz="0" w:space="0"/>
           </w:tblBorders>
+          <w:tblCellMar>
+            <w:top w:w="0" w:type="dxa"/>
+            <w:left w:w="108" w:type="dxa"/>
+            <w:bottom w:w="0" w:type="dxa"/>
+            <w:right w:w="108" w:type="dxa"/>
+          </w:tblCellMar>
         </w:tblPrEx>
         <w:trPr>
           <w:jc w:val="center"/>
@@ -1348,8 +1319,8 @@
           </w:tcPr>
           <w:p>
             <w:pPr>
-              <w:spacing w:after="0"/>
-              <w:jc w:val="center"/>
+              <w:spacing w:after="0" w:line="360" w:lineRule="auto"/>
+              <w:jc w:val="left"/>
             </w:pPr>
             <w:r>
               <w:rPr>
@@ -1374,8 +1345,8 @@
           </w:tcPr>
           <w:p>
             <w:pPr>
-              <w:spacing w:after="0"/>
-              <w:jc w:val="center"/>
+              <w:spacing w:after="0" w:line="360" w:lineRule="auto"/>
+              <w:jc w:val="left"/>
             </w:pPr>
             <w:r>
               <w:rPr>
@@ -1400,8 +1371,8 @@
           </w:tcPr>
           <w:p>
             <w:pPr>
-              <w:spacing w:after="0"/>
-              <w:jc w:val="center"/>
+              <w:spacing w:after="0" w:line="360" w:lineRule="auto"/>
+              <w:jc w:val="left"/>
             </w:pPr>
             <w:r>
               <w:rPr>
@@ -1446,7 +1417,8 @@
           </w:tcPr>
           <w:p>
             <w:pPr>
-              <w:spacing w:after="0"/>
+              <w:spacing w:after="0" w:line="360" w:lineRule="auto"/>
+              <w:jc w:val="left"/>
             </w:pPr>
             <w:r>
               <w:rPr>
@@ -1470,7 +1442,8 @@
           </w:tcPr>
           <w:p>
             <w:pPr>
-              <w:spacing w:after="0"/>
+              <w:spacing w:after="0" w:line="360" w:lineRule="auto"/>
+              <w:jc w:val="left"/>
             </w:pPr>
             <w:r>
               <w:rPr>
@@ -1507,7 +1480,8 @@
           </w:tcPr>
           <w:p>
             <w:pPr>
-              <w:spacing w:after="0"/>
+              <w:spacing w:after="0" w:line="360" w:lineRule="auto"/>
+              <w:jc w:val="left"/>
             </w:pPr>
             <w:r>
               <w:rPr>
@@ -1551,7 +1525,8 @@
           </w:tcPr>
           <w:p>
             <w:pPr>
-              <w:spacing w:after="0"/>
+              <w:spacing w:after="0" w:line="360" w:lineRule="auto"/>
+              <w:jc w:val="left"/>
             </w:pPr>
             <w:r>
               <w:rPr>
@@ -1576,7 +1551,8 @@
           </w:tcPr>
           <w:p>
             <w:pPr>
-              <w:spacing w:after="0"/>
+              <w:spacing w:after="0" w:line="360" w:lineRule="auto"/>
+              <w:jc w:val="left"/>
             </w:pPr>
             <w:r>
               <w:rPr>
@@ -1614,7 +1590,8 @@
           </w:tcPr>
           <w:p>
             <w:pPr>
-              <w:spacing w:after="0"/>
+              <w:spacing w:after="0" w:line="360" w:lineRule="auto"/>
+              <w:jc w:val="left"/>
             </w:pPr>
             <w:r>
               <w:rPr>
@@ -1657,7 +1634,8 @@
           </w:tcPr>
           <w:p>
             <w:pPr>
-              <w:spacing w:after="0"/>
+              <w:spacing w:after="0" w:line="360" w:lineRule="auto"/>
+              <w:jc w:val="left"/>
             </w:pPr>
             <w:r>
               <w:rPr>
@@ -1681,7 +1659,8 @@
           </w:tcPr>
           <w:p>
             <w:pPr>
-              <w:spacing w:after="0"/>
+              <w:spacing w:after="0" w:line="360" w:lineRule="auto"/>
+              <w:jc w:val="left"/>
             </w:pPr>
             <w:r>
               <w:rPr>
@@ -1718,7 +1697,8 @@
           </w:tcPr>
           <w:p>
             <w:pPr>
-              <w:spacing w:after="0"/>
+              <w:spacing w:after="0" w:line="360" w:lineRule="auto"/>
+              <w:jc w:val="left"/>
             </w:pPr>
             <w:r>
               <w:rPr>
@@ -1762,7 +1742,8 @@
           </w:tcPr>
           <w:p>
             <w:pPr>
-              <w:spacing w:after="0"/>
+              <w:spacing w:after="0" w:line="360" w:lineRule="auto"/>
+              <w:jc w:val="left"/>
             </w:pPr>
             <w:r>
               <w:rPr>
@@ -1787,7 +1768,8 @@
           </w:tcPr>
           <w:p>
             <w:pPr>
-              <w:spacing w:after="0"/>
+              <w:spacing w:after="0" w:line="360" w:lineRule="auto"/>
+              <w:jc w:val="left"/>
             </w:pPr>
             <w:r>
               <w:rPr>
@@ -1825,7 +1807,8 @@
           </w:tcPr>
           <w:p>
             <w:pPr>
-              <w:spacing w:after="0"/>
+              <w:spacing w:after="0" w:line="360" w:lineRule="auto"/>
+              <w:jc w:val="left"/>
             </w:pPr>
             <w:r>
               <w:rPr>
@@ -1868,7 +1851,8 @@
           </w:tcPr>
           <w:p>
             <w:pPr>
-              <w:spacing w:after="0"/>
+              <w:spacing w:after="0" w:line="360" w:lineRule="auto"/>
+              <w:jc w:val="left"/>
             </w:pPr>
             <w:r>
               <w:rPr>
@@ -1892,7 +1876,8 @@
           </w:tcPr>
           <w:p>
             <w:pPr>
-              <w:spacing w:after="0"/>
+              <w:spacing w:after="0" w:line="360" w:lineRule="auto"/>
+              <w:jc w:val="left"/>
             </w:pPr>
             <w:r>
               <w:rPr>
@@ -1929,7 +1914,8 @@
           </w:tcPr>
           <w:p>
             <w:pPr>
-              <w:spacing w:after="0"/>
+              <w:spacing w:after="0" w:line="360" w:lineRule="auto"/>
+              <w:jc w:val="left"/>
             </w:pPr>
             <w:r>
               <w:rPr>
@@ -1973,7 +1959,8 @@
           </w:tcPr>
           <w:p>
             <w:pPr>
-              <w:spacing w:after="0"/>
+              <w:spacing w:after="0" w:line="360" w:lineRule="auto"/>
+              <w:jc w:val="left"/>
             </w:pPr>
             <w:r>
               <w:rPr>
@@ -1998,7 +1985,8 @@
           </w:tcPr>
           <w:p>
             <w:pPr>
-              <w:spacing w:after="0"/>
+              <w:spacing w:after="0" w:line="360" w:lineRule="auto"/>
+              <w:jc w:val="left"/>
             </w:pPr>
             <w:r>
               <w:rPr>
@@ -2036,7 +2024,8 @@
           </w:tcPr>
           <w:p>
             <w:pPr>
-              <w:spacing w:after="0"/>
+              <w:spacing w:after="0" w:line="360" w:lineRule="auto"/>
+              <w:jc w:val="left"/>
             </w:pPr>
             <w:r>
               <w:rPr>
@@ -2050,13 +2039,15 @@
     </w:tbl>
     <w:p>
       <w:pPr>
-        <w:spacing w:after="160"/>
+        <w:spacing w:after="160" w:line="360" w:lineRule="auto"/>
+        <w:jc w:val="left"/>
       </w:pPr>
     </w:p>
     <w:p>
       <w:pPr>
         <w:pStyle w:val="3"/>
-        <w:spacing w:before="160" w:after="80"/>
+        <w:spacing w:before="160" w:after="80" w:line="360" w:lineRule="auto"/>
+        <w:jc w:val="left"/>
       </w:pPr>
       <w:r>
         <w:rPr>
@@ -2067,6 +2058,11 @@
       </w:r>
     </w:p>
     <w:p>
+      <w:pPr>
+        <w:spacing w:line="360" w:lineRule="auto"/>
+        <w:ind w:firstLine="720" w:firstLineChars="0"/>
+        <w:jc w:val="left"/>
+      </w:pPr>
       <w:r>
         <w:t>Hiện tại, toàn bộ 'xương sống' logic của hệ thống từ CSDL, Backend API, Mô hình AI dự đoán thời lượng đến Bộ máy tối ưu lập lịch OR-Tools CP-SAT đều đang hoạt động hoàn hảo và sẵn sàng phục vụ kiểm tra.</w:t>
       </w:r>
@@ -2074,7 +2070,17 @@
         <w:br w:type="textWrapping"/>
       </w:r>
       <w:r>
-        <w:t>• Giao diện điều khiển API tương tác (Swagger UI): Sau khi khởi động backend, người dùng/giảng viên có thể truy cập http://localhost:8000/docs để trải nghiệm trực quan toàn bộ các chức năng: đăng nhập nhận token JWT, tạo ca khám bệnh, gọi AI dự đoán số phút thực hiện, và bấm nút để OR-Tools tự động tìm phương án phân công tối ưu nhất.</w:t>
+        <w:t xml:space="preserve">• Giao diện điều khiển API tương tác (Swagger UI): Sau khi khởi động backend, người dùng có thể truy cập </w:t>
+      </w:r>
+      <w:r>
+        <w:rPr>
+          <w:b/>
+          <w:bCs/>
+        </w:rPr>
+        <w:t xml:space="preserve">http://localhost:8000/docs </w:t>
+      </w:r>
+      <w:r>
+        <w:t>để trải nghiệm trực quan toàn bộ các chức năng: đăng nhập nhận token JWT, tạo ca khám bệnh, gọi AI dự đoán số phút thực hiện, và bấm nút để OR-Tools tự động tìm phương án phân công tối ưu nhất.</w:t>
       </w:r>
       <w:r>
         <w:br w:type="textWrapping"/>
@@ -2085,10 +2091,9 @@
     </w:p>
     <w:p>
       <w:pPr>
-        <w:spacing w:after="40"/>
+        <w:spacing w:line="360" w:lineRule="auto"/>
+        <w:jc w:val="left"/>
       </w:pPr>
-    </w:p>
-    <w:p>
       <w:r>
         <w:rPr>
           <w:b/>
@@ -2144,7 +2149,8 @@
           </w:tcPr>
           <w:p>
             <w:pPr>
-              <w:spacing w:before="0" w:after="0" w:line="252" w:lineRule="auto"/>
+              <w:spacing w:before="0" w:after="0" w:line="360" w:lineRule="auto"/>
+              <w:jc w:val="left"/>
             </w:pPr>
             <w:r>
               <w:rPr>
@@ -2312,13 +2318,15 @@
     </w:tbl>
     <w:p>
       <w:pPr>
-        <w:spacing w:after="80"/>
+        <w:spacing w:after="80" w:line="360" w:lineRule="auto"/>
+        <w:jc w:val="left"/>
       </w:pPr>
     </w:p>
     <w:p>
       <w:pPr>
         <w:pStyle w:val="3"/>
-        <w:spacing w:before="160" w:after="80"/>
+        <w:spacing w:before="160" w:after="80" w:line="360" w:lineRule="auto"/>
+        <w:jc w:val="left"/>
       </w:pPr>
       <w:r>
         <w:rPr>
@@ -2329,7 +2337,15 @@
       </w:r>
     </w:p>
     <w:p>
+      <w:pPr>
+        <w:spacing w:line="360" w:lineRule="auto"/>
+        <w:jc w:val="left"/>
+      </w:pPr>
       <w:r>
+        <w:rPr>
+          <w:b/>
+          <w:bCs/>
+        </w:rPr>
         <w:t>a) Các vấn đề kỹ thuật đã xử lý thành công:</w:t>
       </w:r>
       <w:r>
@@ -2354,12 +2370,17 @@
         <w:br w:type="textWrapping"/>
       </w:r>
       <w:r>
-        <w:br w:type="textWrapping"/>
-      </w:r>
-      <w:r>
+        <w:rPr>
+          <w:b/>
+          <w:bCs/>
+        </w:rPr>
         <w:t>b) Các vấn đề còn tồn tại cần tiếp tục phát triển ở Đợt 3:</w:t>
       </w:r>
       <w:r>
+        <w:rPr>
+          <w:b/>
+          <w:bCs/>
+        </w:rPr>
         <w:br w:type="textWrapping"/>
       </w:r>
       <w:r>
@@ -2375,7 +2396,8 @@
     <w:p>
       <w:pPr>
         <w:pStyle w:val="3"/>
-        <w:spacing w:before="160" w:after="80"/>
+        <w:spacing w:before="160" w:after="80" w:line="360" w:lineRule="auto"/>
+        <w:jc w:val="left"/>
       </w:pPr>
       <w:r>
         <w:rPr>
@@ -2386,12 +2408,30 @@
       </w:r>
     </w:p>
     <w:p>
+      <w:pPr>
+        <w:spacing w:line="360" w:lineRule="auto"/>
+        <w:jc w:val="left"/>
+        <w:rPr>
+          <w:rFonts w:hint="default"/>
+          <w:lang w:val="en-US"/>
+        </w:rPr>
+      </w:pPr>
       <w:r>
-        <w:t>Để chuẩn bị tốt nhất cho Đợt 3 (xây dựng giao diện Web Frontend và hoàn thiện bài báo cáo tốt nghiệp), em kính mong Cô tư vấn cho em 3 câu hỏi sau:</w:t>
+        <w:t xml:space="preserve">Để chuẩn bị tốt nhất cho Đợt 3 (xây dựng giao diện Web Frontend ), </w:t>
       </w:r>
       <w:r>
-        <w:br w:type="textWrapping"/>
+        <w:rPr>
+          <w:rFonts w:hint="default"/>
+          <w:lang w:val="en-US"/>
+        </w:rPr>
+        <w:t>em có 3 câu hỏi sau:</w:t>
       </w:r>
+    </w:p>
+    <w:p>
+      <w:pPr>
+        <w:spacing w:line="360" w:lineRule="auto"/>
+        <w:jc w:val="left"/>
+      </w:pPr>
       <w:r>
         <w:t>1. Về cơ chế Human-in-the-loop trên giao diện: Khi Điều phối viên quyết định không chọn Top-1 mà chọn nhân viên khác xếp thứ 2 hoặc thứ 3 (Override), hệ thống nên bắt buộc chọn lý do từ danh mục định sẵn (dropdown: Kỹ năng chuyên sâu, Khách hàng quen, Yêu cầu ngôn ngữ...) hay nên cho phép nhập ghi chú tự do, để sau này thuận tiện cho việc thống kê báo cáo trong luận văn ạ?</w:t>
       </w:r>
@@ -2399,7 +2439,7 @@
         <w:br w:type="textWrapping"/>
       </w:r>
       <w:r>
-        <w:t>2. Về thiết kế Màn hình Lập lịch (Dispatch Board): Cô khuyến nghị em nên trình bày lịch theo dạng Bảng Kanban (các cột là nhân viên, các thẻ là ca khám) hay dạng Timeline / Gantt Chart (trục ngang là giờ trong ngày từ 07:30 đến 17:30) để tạo ấn tượng tốt nhất về mặt trải nghiệm người dùng (UX/UI) trước Hội đồng ạ?</w:t>
+        <w:t>2. Về thiết kế Màn hình Lập lịch (Dispatch Board): em nên trình bày lịch theo dạng Bảng Kanban (các cột là nhân viên, các thẻ là ca khám) hay dạng Timeline / Gantt Chart (trục ngang là giờ trong ngày từ 07:30 đến 17:30) để tạo ấn tượng tốt nhất về mặt trải nghiệm người dùng (UX/UI) trước Hội đồng ạ?</w:t>
       </w:r>
       <w:r>
         <w:br w:type="textWrapping"/>
@@ -2407,16 +2447,14 @@
       <w:r>
         <w:t>3. Về quy mô kịch bản thực nghiệm: Bảng đối sánh 4 chiến lược lập lịch và Thí nghiệm bóc tách Ablation study hiện tại đã đủ các chỉ số theo yêu cầu của Cô chưa, hay em cần bổ sung thêm kịch bản kiểm tra độ nhạy (Sensitivity Analysis) khi số lượng ca tăng đột biến (Stress Test 50 – 100 ca/ngày) ạ?</w:t>
       </w:r>
-    </w:p>
-    <w:p>
-      <w:pPr>
-        <w:spacing w:after="200"/>
-      </w:pPr>
+      <w:bookmarkStart w:id="0" w:name="_GoBack"/>
+      <w:bookmarkEnd w:id="0"/>
     </w:p>
     <w:p>
       <w:pPr>
         <w:pStyle w:val="2"/>
-        <w:spacing w:before="280" w:after="120"/>
+        <w:spacing w:before="280" w:after="120" w:line="360" w:lineRule="auto"/>
+        <w:jc w:val="left"/>
       </w:pPr>
       <w:r>
         <w:rPr>
@@ -2429,7 +2467,8 @@
     <w:p>
       <w:pPr>
         <w:pStyle w:val="3"/>
-        <w:spacing w:before="160" w:after="80"/>
+        <w:spacing w:before="160" w:after="80" w:line="360" w:lineRule="auto"/>
+        <w:jc w:val="left"/>
       </w:pPr>
       <w:r>
         <w:rPr>
@@ -2440,6 +2479,10 @@
       </w:r>
     </w:p>
     <w:p>
+      <w:pPr>
+        <w:spacing w:line="360" w:lineRule="auto"/>
+        <w:jc w:val="left"/>
+      </w:pPr>
       <w:r>
         <w:t>Hệ thống cơ sở dữ liệu đã được thiết kế và đồng bộ 1–1 với Data Dictionary v2.1, bao gồm 23 bảng phân chia thành 6 phân hệ cốt lõi:</w:t>
       </w:r>
@@ -2491,11 +2534,15 @@
     </w:p>
     <w:p>
       <w:pPr>
-        <w:spacing w:before="160" w:after="40"/>
-        <w:jc w:val="center"/>
+        <w:spacing w:before="160" w:after="40" w:line="360" w:lineRule="auto"/>
+        <w:jc w:val="left"/>
       </w:pPr>
     </w:p>
     <w:p>
+      <w:pPr>
+        <w:spacing w:line="360" w:lineRule="auto"/>
+        <w:jc w:val="left"/>
+      </w:pPr>
       <w:r>
         <w:drawing>
           <wp:inline distT="0" distB="0" distL="114300" distR="114300">
@@ -2538,8 +2585,8 @@
     </w:p>
     <w:p>
       <w:pPr>
-        <w:spacing w:after="240"/>
-        <w:jc w:val="center"/>
+        <w:spacing w:after="240" w:line="360" w:lineRule="auto"/>
+        <w:jc w:val="left"/>
       </w:pPr>
       <w:r>
         <w:rPr>
@@ -2555,7 +2602,8 @@
     <w:p>
       <w:pPr>
         <w:pStyle w:val="3"/>
-        <w:spacing w:before="160" w:after="80"/>
+        <w:spacing w:before="160" w:after="80" w:line="360" w:lineRule="auto"/>
+        <w:jc w:val="left"/>
       </w:pPr>
       <w:r>
         <w:rPr>
@@ -2566,22 +2614,39 @@
       </w:r>
     </w:p>
     <w:p>
+      <w:pPr>
+        <w:spacing w:line="360" w:lineRule="auto"/>
+        <w:jc w:val="left"/>
+      </w:pPr>
       <w:r>
-        <w:t>Hệ thống vận hành theo đúng trục giá trị thông tin khép kín mà Cô đã chỉ đạo tại Mục 7: 'Data → AI Duration Prediction → Constraint-aware Scheduling → Human Review → Assignment → Actual Result → Evaluation'. Quy trình được mô hình hóa bằng sơ đồ hoạt động (Activity Diagram) thể hiện sự tương tác nhịp nhàng giữa 4 tác nhân: Khách hàng/Bệnh nhân, Điều phối viên (Coordinator), Nhân viên y tế (Medical Staff) và Động cơ AI/Hệ thống.</w:t>
+        <w:t xml:space="preserve"> 'Data → AI Duration Prediction → Constraint-aware Scheduling → Human Review → Assignment → Actual Result → Evaluation'. </w:t>
       </w:r>
     </w:p>
     <w:p>
       <w:pPr>
-        <w:spacing w:before="160" w:after="40"/>
-        <w:jc w:val="center"/>
+        <w:spacing w:line="360" w:lineRule="auto"/>
+        <w:jc w:val="left"/>
+      </w:pPr>
+      <w:r>
+        <w:t>Quy trình được mô hình hóa bằng sơ đồ hoạt động (Activity Diagram) thể hiện sự tương tác nhịp nhàng giữa 4 tác nhân: Khách hàng/Bệnh nhân, Điều phối viên (Coordinator), Nhân viên y tế (Medical Staff) và Động cơ AI/Hệ thống.</w:t>
+      </w:r>
+    </w:p>
+    <w:p>
+      <w:pPr>
+        <w:spacing w:before="160" w:after="40" w:line="360" w:lineRule="auto"/>
+        <w:jc w:val="left"/>
       </w:pPr>
     </w:p>
     <w:p>
+      <w:pPr>
+        <w:spacing w:line="360" w:lineRule="auto"/>
+        <w:jc w:val="left"/>
+      </w:pPr>
       <w:r>
         <w:drawing>
           <wp:inline distT="0" distB="0" distL="114300" distR="114300">
             <wp:extent cx="5669280" cy="4961890"/>
-            <wp:effectExtent l="0" t="0" r="0" b="0"/>
+            <wp:effectExtent l="0" t="0" r="0" b="6350"/>
             <wp:docPr id="2" name="Picture 2"/>
             <wp:cNvGraphicFramePr>
               <a:graphicFrameLocks xmlns:a="http://schemas.openxmlformats.org/drawingml/2006/main" noChangeAspect="1"/>
@@ -2619,8 +2684,8 @@
     </w:p>
     <w:p>
       <w:pPr>
-        <w:spacing w:after="240"/>
-        <w:jc w:val="center"/>
+        <w:spacing w:after="240" w:line="360" w:lineRule="auto"/>
+        <w:jc w:val="left"/>
       </w:pPr>
       <w:r>
         <w:rPr>
@@ -2636,7 +2701,8 @@
     <w:p>
       <w:pPr>
         <w:pStyle w:val="3"/>
-        <w:spacing w:before="160" w:after="80"/>
+        <w:spacing w:before="160" w:after="80" w:line="360" w:lineRule="auto"/>
+        <w:jc w:val="left"/>
       </w:pPr>
       <w:r>
         <w:rPr>
@@ -2647,6 +2713,10 @@
       </w:r>
     </w:p>
     <w:p>
+      <w:pPr>
+        <w:spacing w:line="360" w:lineRule="auto"/>
+        <w:jc w:val="left"/>
+      </w:pPr>
       <w:r>
         <w:t>• Bộ dữ liệu (Dataset ML v1): Gồm 800 mẫu ca chăm sóc y tế tại 8 phường thuộc TP. Nha Trang. Tuân thủ nguyên tắc No Data Leakage, chỉ sử dụng 8 đặc trưng đã biết trước khi lập lịch:</w:t>
       </w:r>
@@ -2713,7 +2783,8 @@
     </w:p>
     <w:p>
       <w:pPr>
-        <w:spacing w:before="80" w:after="80"/>
+        <w:spacing w:before="80" w:after="80" w:line="360" w:lineRule="auto"/>
+        <w:jc w:val="left"/>
       </w:pPr>
       <w:r>
         <w:rPr>
@@ -2746,11 +2817,11 @@
         </w:tblCellMar>
       </w:tblPr>
       <w:tblGrid>
-        <w:gridCol w:w="3067"/>
-        <w:gridCol w:w="1622"/>
-        <w:gridCol w:w="1633"/>
-        <w:gridCol w:w="1626"/>
-        <w:gridCol w:w="1874"/>
+        <w:gridCol w:w="3010"/>
+        <w:gridCol w:w="1650"/>
+        <w:gridCol w:w="1659"/>
+        <w:gridCol w:w="1653"/>
+        <w:gridCol w:w="1850"/>
       </w:tblGrid>
       <w:tr>
         <w:tblPrEx>
@@ -2785,8 +2856,8 @@
           </w:tcPr>
           <w:p>
             <w:pPr>
-              <w:spacing w:after="0"/>
-              <w:jc w:val="center"/>
+              <w:spacing w:after="0" w:line="360" w:lineRule="auto"/>
+              <w:jc w:val="left"/>
             </w:pPr>
             <w:r>
               <w:rPr>
@@ -2811,8 +2882,8 @@
           </w:tcPr>
           <w:p>
             <w:pPr>
-              <w:spacing w:after="0"/>
-              <w:jc w:val="center"/>
+              <w:spacing w:after="0" w:line="360" w:lineRule="auto"/>
+              <w:jc w:val="left"/>
             </w:pPr>
             <w:r>
               <w:rPr>
@@ -2837,8 +2908,8 @@
           </w:tcPr>
           <w:p>
             <w:pPr>
-              <w:spacing w:after="0"/>
-              <w:jc w:val="center"/>
+              <w:spacing w:after="0" w:line="360" w:lineRule="auto"/>
+              <w:jc w:val="left"/>
             </w:pPr>
             <w:r>
               <w:rPr>
@@ -2863,8 +2934,8 @@
           </w:tcPr>
           <w:p>
             <w:pPr>
-              <w:spacing w:after="0"/>
-              <w:jc w:val="center"/>
+              <w:spacing w:after="0" w:line="360" w:lineRule="auto"/>
+              <w:jc w:val="left"/>
             </w:pPr>
             <w:r>
               <w:rPr>
@@ -2889,8 +2960,8 @@
           </w:tcPr>
           <w:p>
             <w:pPr>
-              <w:spacing w:after="0"/>
-              <w:jc w:val="center"/>
+              <w:spacing w:after="0" w:line="360" w:lineRule="auto"/>
+              <w:jc w:val="left"/>
             </w:pPr>
             <w:r>
               <w:rPr>
@@ -2935,7 +3006,8 @@
           </w:tcPr>
           <w:p>
             <w:pPr>
-              <w:spacing w:after="0"/>
+              <w:spacing w:after="0" w:line="360" w:lineRule="auto"/>
+              <w:jc w:val="left"/>
             </w:pPr>
             <w:r>
               <w:rPr>
@@ -2957,14 +3029,14 @@
           </w:tcPr>
           <w:p>
             <w:pPr>
-              <w:spacing w:after="0"/>
-              <w:jc w:val="center"/>
+              <w:spacing w:after="0" w:line="360" w:lineRule="auto"/>
+              <w:jc w:val="left"/>
             </w:pPr>
             <w:r>
               <w:rPr>
                 <w:sz w:val="18"/>
               </w:rPr>
-              <w:t>13.483</w:t>
+              <w:t>12.325</w:t>
             </w:r>
           </w:p>
         </w:tc>
@@ -2980,14 +3052,14 @@
           </w:tcPr>
           <w:p>
             <w:pPr>
-              <w:spacing w:after="0"/>
-              <w:jc w:val="center"/>
+              <w:spacing w:after="0" w:line="360" w:lineRule="auto"/>
+              <w:jc w:val="left"/>
             </w:pPr>
             <w:r>
               <w:rPr>
                 <w:sz w:val="18"/>
               </w:rPr>
-              <w:t>16.839</w:t>
+              <w:t>15.965</w:t>
             </w:r>
           </w:p>
         </w:tc>
@@ -3003,14 +3075,14 @@
           </w:tcPr>
           <w:p>
             <w:pPr>
-              <w:spacing w:after="0"/>
-              <w:jc w:val="center"/>
+              <w:spacing w:after="0" w:line="360" w:lineRule="auto"/>
+              <w:jc w:val="left"/>
             </w:pPr>
             <w:r>
               <w:rPr>
                 <w:sz w:val="18"/>
               </w:rPr>
-              <w:t>0.3179</w:t>
+              <w:t>0.5468</w:t>
             </w:r>
           </w:p>
         </w:tc>
@@ -3026,7 +3098,8 @@
           </w:tcPr>
           <w:p>
             <w:pPr>
-              <w:spacing w:after="0"/>
+              <w:spacing w:after="0" w:line="360" w:lineRule="auto"/>
+              <w:jc w:val="left"/>
             </w:pPr>
             <w:r>
               <w:rPr>
@@ -3070,7 +3143,8 @@
           </w:tcPr>
           <w:p>
             <w:pPr>
-              <w:spacing w:after="0"/>
+              <w:spacing w:after="0" w:line="360" w:lineRule="auto"/>
+              <w:jc w:val="left"/>
             </w:pPr>
             <w:r>
               <w:rPr>
@@ -3093,14 +3167,14 @@
           </w:tcPr>
           <w:p>
             <w:pPr>
-              <w:spacing w:after="0"/>
-              <w:jc w:val="center"/>
+              <w:spacing w:after="0" w:line="360" w:lineRule="auto"/>
+              <w:jc w:val="left"/>
             </w:pPr>
             <w:r>
               <w:rPr>
                 <w:sz w:val="18"/>
               </w:rPr>
-              <w:t>9.193</w:t>
+              <w:t>8.111</w:t>
             </w:r>
           </w:p>
         </w:tc>
@@ -3117,14 +3191,14 @@
           </w:tcPr>
           <w:p>
             <w:pPr>
-              <w:spacing w:after="0"/>
-              <w:jc w:val="center"/>
+              <w:spacing w:after="0" w:line="360" w:lineRule="auto"/>
+              <w:jc w:val="left"/>
             </w:pPr>
             <w:r>
               <w:rPr>
                 <w:sz w:val="18"/>
               </w:rPr>
-              <w:t>11.294</w:t>
+              <w:t>10.162</w:t>
             </w:r>
           </w:p>
         </w:tc>
@@ -3141,14 +3215,14 @@
           </w:tcPr>
           <w:p>
             <w:pPr>
-              <w:spacing w:after="0"/>
-              <w:jc w:val="center"/>
+              <w:spacing w:after="0" w:line="360" w:lineRule="auto"/>
+              <w:jc w:val="left"/>
             </w:pPr>
             <w:r>
               <w:rPr>
                 <w:sz w:val="18"/>
               </w:rPr>
-              <w:t>0.6932</w:t>
+              <w:t>0.8164</w:t>
             </w:r>
           </w:p>
         </w:tc>
@@ -3165,7 +3239,8 @@
           </w:tcPr>
           <w:p>
             <w:pPr>
-              <w:spacing w:after="0"/>
+              <w:spacing w:after="0" w:line="360" w:lineRule="auto"/>
+              <w:jc w:val="left"/>
             </w:pPr>
             <w:r>
               <w:rPr>
@@ -3208,7 +3283,8 @@
           </w:tcPr>
           <w:p>
             <w:pPr>
-              <w:spacing w:after="0"/>
+              <w:spacing w:after="0" w:line="360" w:lineRule="auto"/>
+              <w:jc w:val="left"/>
             </w:pPr>
             <w:r>
               <w:rPr>
@@ -3230,14 +3306,14 @@
           </w:tcPr>
           <w:p>
             <w:pPr>
-              <w:spacing w:after="0"/>
-              <w:jc w:val="center"/>
+              <w:spacing w:after="0" w:line="360" w:lineRule="auto"/>
+              <w:jc w:val="left"/>
             </w:pPr>
             <w:r>
               <w:rPr>
                 <w:sz w:val="18"/>
               </w:rPr>
-              <w:t>4.467</w:t>
+              <w:t>5.033</w:t>
             </w:r>
           </w:p>
         </w:tc>
@@ -3253,14 +3329,14 @@
           </w:tcPr>
           <w:p>
             <w:pPr>
-              <w:spacing w:after="0"/>
-              <w:jc w:val="center"/>
+              <w:spacing w:after="0" w:line="360" w:lineRule="auto"/>
+              <w:jc w:val="left"/>
             </w:pPr>
             <w:r>
               <w:rPr>
                 <w:sz w:val="18"/>
               </w:rPr>
-              <w:t>5.881</w:t>
+              <w:t>6.249</w:t>
             </w:r>
           </w:p>
         </w:tc>
@@ -3276,14 +3352,14 @@
           </w:tcPr>
           <w:p>
             <w:pPr>
-              <w:spacing w:after="0"/>
-              <w:jc w:val="center"/>
+              <w:spacing w:after="0" w:line="360" w:lineRule="auto"/>
+              <w:jc w:val="left"/>
             </w:pPr>
             <w:r>
               <w:rPr>
                 <w:sz w:val="18"/>
               </w:rPr>
-              <w:t>0.9168</w:t>
+              <w:t>0.9306</w:t>
             </w:r>
           </w:p>
         </w:tc>
@@ -3299,152 +3375,14 @@
           </w:tcPr>
           <w:p>
             <w:pPr>
-              <w:spacing w:after="0"/>
+              <w:spacing w:after="0" w:line="360" w:lineRule="auto"/>
+              <w:jc w:val="left"/>
             </w:pPr>
             <w:r>
               <w:rPr>
                 <w:sz w:val="18"/>
               </w:rPr>
               <w:t>Tuyến tính có điều chuẩn</w:t>
-            </w:r>
-          </w:p>
-        </w:tc>
-      </w:tr>
-      <w:tr>
-        <w:tblPrEx>
-          <w:tblBorders>
-            <w:top w:val="single" w:color="D3D3D3" w:sz="4" w:space="0"/>
-            <w:left w:val="none" w:color="auto" w:sz="0" w:space="0"/>
-            <w:bottom w:val="single" w:color="D3D3D3" w:sz="4" w:space="0"/>
-            <w:right w:val="none" w:color="auto" w:sz="0" w:space="0"/>
-            <w:insideH w:val="single" w:color="D3D3D3" w:sz="4" w:space="0"/>
-            <w:insideV w:val="none" w:color="auto" w:sz="0" w:space="0"/>
-          </w:tblBorders>
-          <w:tblCellMar>
-            <w:top w:w="0" w:type="dxa"/>
-            <w:left w:w="108" w:type="dxa"/>
-            <w:bottom w:w="0" w:type="dxa"/>
-            <w:right w:w="108" w:type="dxa"/>
-          </w:tblCellMar>
-        </w:tblPrEx>
-        <w:trPr>
-          <w:jc w:val="center"/>
-        </w:trPr>
-        <w:tc>
-          <w:tcPr>
-            <w:tcW w:w="3168" w:type="dxa"/>
-            <w:shd w:val="clear" w:color="auto" w:fill="F4F6F9"/>
-            <w:tcMar>
-              <w:top w:w="70" w:type="dxa"/>
-              <w:left w:w="80" w:type="dxa"/>
-              <w:bottom w:w="70" w:type="dxa"/>
-              <w:right w:w="80" w:type="dxa"/>
-            </w:tcMar>
-          </w:tcPr>
-          <w:p>
-            <w:pPr>
-              <w:spacing w:after="0"/>
-            </w:pPr>
-            <w:r>
-              <w:rPr>
-                <w:sz w:val="18"/>
-              </w:rPr>
-              <w:t>Random Forest Regressor</w:t>
-            </w:r>
-          </w:p>
-        </w:tc>
-        <w:tc>
-          <w:tcPr>
-            <w:tcW w:w="1296" w:type="dxa"/>
-            <w:shd w:val="clear" w:color="auto" w:fill="F4F6F9"/>
-            <w:tcMar>
-              <w:top w:w="70" w:type="dxa"/>
-              <w:left w:w="80" w:type="dxa"/>
-              <w:bottom w:w="70" w:type="dxa"/>
-              <w:right w:w="80" w:type="dxa"/>
-            </w:tcMar>
-          </w:tcPr>
-          <w:p>
-            <w:pPr>
-              <w:spacing w:after="0"/>
-              <w:jc w:val="center"/>
-            </w:pPr>
-            <w:r>
-              <w:rPr>
-                <w:sz w:val="18"/>
-              </w:rPr>
-              <w:t>4.634</w:t>
-            </w:r>
-          </w:p>
-        </w:tc>
-        <w:tc>
-          <w:tcPr>
-            <w:tcW w:w="1440" w:type="dxa"/>
-            <w:shd w:val="clear" w:color="auto" w:fill="F4F6F9"/>
-            <w:tcMar>
-              <w:top w:w="70" w:type="dxa"/>
-              <w:left w:w="80" w:type="dxa"/>
-              <w:bottom w:w="70" w:type="dxa"/>
-              <w:right w:w="80" w:type="dxa"/>
-            </w:tcMar>
-          </w:tcPr>
-          <w:p>
-            <w:pPr>
-              <w:spacing w:after="0"/>
-              <w:jc w:val="center"/>
-            </w:pPr>
-            <w:r>
-              <w:rPr>
-                <w:sz w:val="18"/>
-              </w:rPr>
-              <w:t>6.067</w:t>
-            </w:r>
-          </w:p>
-        </w:tc>
-        <w:tc>
-          <w:tcPr>
-            <w:tcW w:w="1296" w:type="dxa"/>
-            <w:shd w:val="clear" w:color="auto" w:fill="F4F6F9"/>
-            <w:tcMar>
-              <w:top w:w="70" w:type="dxa"/>
-              <w:left w:w="80" w:type="dxa"/>
-              <w:bottom w:w="70" w:type="dxa"/>
-              <w:right w:w="80" w:type="dxa"/>
-            </w:tcMar>
-          </w:tcPr>
-          <w:p>
-            <w:pPr>
-              <w:spacing w:after="0"/>
-              <w:jc w:val="center"/>
-            </w:pPr>
-            <w:r>
-              <w:rPr>
-                <w:sz w:val="18"/>
-              </w:rPr>
-              <w:t>0.9115</w:t>
-            </w:r>
-          </w:p>
-        </w:tc>
-        <w:tc>
-          <w:tcPr>
-            <w:tcW w:w="2160" w:type="dxa"/>
-            <w:shd w:val="clear" w:color="auto" w:fill="F4F6F9"/>
-            <w:tcMar>
-              <w:top w:w="70" w:type="dxa"/>
-              <w:left w:w="80" w:type="dxa"/>
-              <w:bottom w:w="70" w:type="dxa"/>
-              <w:right w:w="80" w:type="dxa"/>
-            </w:tcMar>
-          </w:tcPr>
-          <w:p>
-            <w:pPr>
-              <w:spacing w:after="0"/>
-            </w:pPr>
-            <w:r>
-              <w:rPr>
-                <w:sz w:val="18"/>
-              </w:rPr>
-              <w:t>Rừng cây quyết định (Ensemble)</w:t>
             </w:r>
           </w:p>
         </w:tc>
@@ -3482,7 +3420,8 @@
           </w:tcPr>
           <w:p>
             <w:pPr>
-              <w:spacing w:after="0"/>
+              <w:spacing w:after="0" w:line="360" w:lineRule="auto"/>
+              <w:jc w:val="left"/>
             </w:pPr>
             <w:r>
               <w:rPr>
@@ -3490,7 +3429,7 @@
                 <w:color w:val="1B365D"/>
                 <w:sz w:val="19"/>
               </w:rPr>
-              <w:t>HistGradientBoostingRegressor</w:t>
+              <w:t>Random Forest Regressor</w:t>
             </w:r>
           </w:p>
         </w:tc>
@@ -3507,8 +3446,8 @@
           </w:tcPr>
           <w:p>
             <w:pPr>
-              <w:spacing w:after="0"/>
-              <w:jc w:val="center"/>
+              <w:spacing w:after="0" w:line="360" w:lineRule="auto"/>
+              <w:jc w:val="left"/>
             </w:pPr>
             <w:r>
               <w:rPr>
@@ -3516,7 +3455,7 @@
                 <w:color w:val="1B365D"/>
                 <w:sz w:val="19"/>
               </w:rPr>
-              <w:t>4.430</w:t>
+              <w:t>4.710</w:t>
             </w:r>
           </w:p>
         </w:tc>
@@ -3533,8 +3472,8 @@
           </w:tcPr>
           <w:p>
             <w:pPr>
-              <w:spacing w:after="0"/>
-              <w:jc w:val="center"/>
+              <w:spacing w:after="0" w:line="360" w:lineRule="auto"/>
+              <w:jc w:val="left"/>
             </w:pPr>
             <w:r>
               <w:rPr>
@@ -3542,7 +3481,7 @@
                 <w:color w:val="1B365D"/>
                 <w:sz w:val="19"/>
               </w:rPr>
-              <w:t>5.767</w:t>
+              <w:t>6.105</w:t>
             </w:r>
           </w:p>
         </w:tc>
@@ -3559,8 +3498,8 @@
           </w:tcPr>
           <w:p>
             <w:pPr>
-              <w:spacing w:after="0"/>
-              <w:jc w:val="center"/>
+              <w:spacing w:after="0" w:line="360" w:lineRule="auto"/>
+              <w:jc w:val="left"/>
             </w:pPr>
             <w:r>
               <w:rPr>
@@ -3568,7 +3507,7 @@
                 <w:color w:val="1B365D"/>
                 <w:sz w:val="19"/>
               </w:rPr>
-              <w:t>0.9200</w:t>
+              <w:t>0.9337</w:t>
             </w:r>
           </w:p>
         </w:tc>
@@ -3585,7 +3524,8 @@
           </w:tcPr>
           <w:p>
             <w:pPr>
-              <w:spacing w:after="0"/>
+              <w:spacing w:after="0" w:line="360" w:lineRule="auto"/>
+              <w:jc w:val="left"/>
             </w:pPr>
             <w:r>
               <w:rPr>
@@ -3598,30 +3538,16 @@
           </w:p>
         </w:tc>
       </w:tr>
-    </w:tbl>
-    <w:p>
-      <w:pPr>
-        <w:spacing w:after="80"/>
-      </w:pPr>
-    </w:p>
-    <w:tbl>
-      <w:tblPr>
-        <w:tblStyle w:val="12"/>
-        <w:tblW w:w="0" w:type="auto"/>
-        <w:jc w:val="center"/>
-        <w:tblLayout w:type="fixed"/>
-        <w:tblCellMar>
-          <w:top w:w="0" w:type="dxa"/>
-          <w:left w:w="108" w:type="dxa"/>
-          <w:bottom w:w="0" w:type="dxa"/>
-          <w:right w:w="108" w:type="dxa"/>
-        </w:tblCellMar>
-      </w:tblPr>
-      <w:tblGrid>
-        <w:gridCol w:w="9662"/>
-      </w:tblGrid>
       <w:tr>
         <w:tblPrEx>
+          <w:tblBorders>
+            <w:top w:val="single" w:color="D3D3D3" w:sz="4" w:space="0"/>
+            <w:left w:val="none" w:color="auto" w:sz="0" w:space="0"/>
+            <w:bottom w:val="single" w:color="D3D3D3" w:sz="4" w:space="0"/>
+            <w:right w:val="none" w:color="auto" w:sz="0" w:space="0"/>
+            <w:insideH w:val="single" w:color="D3D3D3" w:sz="4" w:space="0"/>
+            <w:insideV w:val="none" w:color="auto" w:sz="0" w:space="0"/>
+          </w:tblBorders>
           <w:tblCellMar>
             <w:top w:w="0" w:type="dxa"/>
             <w:left w:w="108" w:type="dxa"/>
@@ -3634,51 +3560,116 @@
         </w:trPr>
         <w:tc>
           <w:tcPr>
-            <w:tcW w:w="9072" w:type="dxa"/>
-            <w:tcBorders>
-              <w:top w:val="nil"/>
-              <w:left w:val="single" w:color="1B365D" w:sz="24" w:space="0"/>
-              <w:bottom w:val="nil"/>
-              <w:right w:val="nil"/>
-            </w:tcBorders>
-            <w:shd w:val="clear" w:color="auto" w:fill="F8F9FA"/>
+            <w:tcW w:w="3168" w:type="dxa"/>
             <w:tcMar>
-              <w:top w:w="140" w:type="dxa"/>
-              <w:left w:w="200" w:type="dxa"/>
-              <w:bottom w:w="140" w:type="dxa"/>
-              <w:right w:w="150" w:type="dxa"/>
+              <w:top w:w="70" w:type="dxa"/>
+              <w:left w:w="80" w:type="dxa"/>
+              <w:bottom w:w="70" w:type="dxa"/>
+              <w:right w:w="80" w:type="dxa"/>
             </w:tcMar>
           </w:tcPr>
           <w:p>
             <w:pPr>
-              <w:spacing w:before="0" w:after="40" w:line="276" w:lineRule="auto"/>
+              <w:spacing w:after="0" w:line="360" w:lineRule="auto"/>
+              <w:jc w:val="left"/>
             </w:pPr>
             <w:r>
               <w:rPr>
-                <w:rFonts w:ascii="Times New Roman" w:hAnsi="Times New Roman"/>
-                <w:b/>
-                <w:color w:val="1B365D"/>
-                <w:sz w:val="22"/>
-              </w:rPr>
-              <w:t>📌 KẾT LUẬN ĐÓNG GÓP CỦA MÔ HÌNH MACHINE LEARNING</w:t>
-            </w:r>
-            <w:r>
-              <w:rPr>
-                <w:rFonts w:ascii="Times New Roman" w:hAnsi="Times New Roman"/>
-                <w:b/>
-                <w:color w:val="1B365D"/>
-                <w:sz w:val="22"/>
-              </w:rPr>
-              <w:br w:type="textWrapping"/>
-            </w:r>
-            <w:r>
-              <w:rPr>
-                <w:rFonts w:ascii="Times New Roman" w:hAnsi="Times New Roman"/>
-                <w:i/>
-                <w:color w:val="282828"/>
-                <w:sz w:val="21"/>
-              </w:rPr>
-              <w:t>Ý nghĩa học thuật cho đồ án MIS: Việc ứng dụng mô hình HistGradientBoostingRegressor đã giúp giảm 67.1% sai số dự đoán thời lượng so với định mức cố định (MAE giảm từ 13.48 phút xuống 4.43 phút). Mô hình giải thích được 92% sự biến thiên thực tế (R² = 0.920), cung cấp đầu vào chính xác tuyệt đối cho thuật toán lập lịch.</w:t>
+                <w:sz w:val="18"/>
+              </w:rPr>
+              <w:t>HistGradientBoostingRegressor</w:t>
+            </w:r>
+          </w:p>
+        </w:tc>
+        <w:tc>
+          <w:tcPr>
+            <w:tcW w:w="1296" w:type="dxa"/>
+            <w:tcMar>
+              <w:top w:w="70" w:type="dxa"/>
+              <w:left w:w="80" w:type="dxa"/>
+              <w:bottom w:w="70" w:type="dxa"/>
+              <w:right w:w="80" w:type="dxa"/>
+            </w:tcMar>
+          </w:tcPr>
+          <w:p>
+            <w:pPr>
+              <w:spacing w:after="0" w:line="360" w:lineRule="auto"/>
+              <w:jc w:val="left"/>
+            </w:pPr>
+            <w:r>
+              <w:rPr>
+                <w:sz w:val="18"/>
+              </w:rPr>
+              <w:t>4.750</w:t>
+            </w:r>
+          </w:p>
+        </w:tc>
+        <w:tc>
+          <w:tcPr>
+            <w:tcW w:w="1440" w:type="dxa"/>
+            <w:tcMar>
+              <w:top w:w="70" w:type="dxa"/>
+              <w:left w:w="80" w:type="dxa"/>
+              <w:bottom w:w="70" w:type="dxa"/>
+              <w:right w:w="80" w:type="dxa"/>
+            </w:tcMar>
+          </w:tcPr>
+          <w:p>
+            <w:pPr>
+              <w:spacing w:after="0" w:line="360" w:lineRule="auto"/>
+              <w:jc w:val="left"/>
+            </w:pPr>
+            <w:r>
+              <w:rPr>
+                <w:sz w:val="18"/>
+              </w:rPr>
+              <w:t>6.074</w:t>
+            </w:r>
+          </w:p>
+        </w:tc>
+        <w:tc>
+          <w:tcPr>
+            <w:tcW w:w="1296" w:type="dxa"/>
+            <w:tcMar>
+              <w:top w:w="70" w:type="dxa"/>
+              <w:left w:w="80" w:type="dxa"/>
+              <w:bottom w:w="70" w:type="dxa"/>
+              <w:right w:w="80" w:type="dxa"/>
+            </w:tcMar>
+          </w:tcPr>
+          <w:p>
+            <w:pPr>
+              <w:spacing w:after="0" w:line="360" w:lineRule="auto"/>
+              <w:jc w:val="left"/>
+            </w:pPr>
+            <w:r>
+              <w:rPr>
+                <w:sz w:val="18"/>
+              </w:rPr>
+              <w:t>0.9344</w:t>
+            </w:r>
+          </w:p>
+        </w:tc>
+        <w:tc>
+          <w:tcPr>
+            <w:tcW w:w="2160" w:type="dxa"/>
+            <w:tcMar>
+              <w:top w:w="70" w:type="dxa"/>
+              <w:left w:w="80" w:type="dxa"/>
+              <w:bottom w:w="70" w:type="dxa"/>
+              <w:right w:w="80" w:type="dxa"/>
+            </w:tcMar>
+          </w:tcPr>
+          <w:p>
+            <w:pPr>
+              <w:spacing w:after="0" w:line="360" w:lineRule="auto"/>
+              <w:jc w:val="left"/>
+            </w:pPr>
+            <w:r>
+              <w:rPr>
+                <w:sz w:val="18"/>
+              </w:rPr>
+              <w:t>Tương đương Random Forest</w:t>
             </w:r>
           </w:p>
         </w:tc>
@@ -3686,13 +3677,15 @@
     </w:tbl>
     <w:p>
       <w:pPr>
-        <w:spacing w:after="80"/>
+        <w:spacing w:after="80" w:line="360" w:lineRule="auto"/>
+        <w:jc w:val="left"/>
       </w:pPr>
     </w:p>
     <w:p>
       <w:pPr>
         <w:pStyle w:val="3"/>
-        <w:spacing w:before="160" w:after="80"/>
+        <w:spacing w:before="160" w:after="80" w:line="360" w:lineRule="auto"/>
+        <w:jc w:val="left"/>
       </w:pPr>
       <w:r>
         <w:rPr>
@@ -3703,6 +3696,10 @@
       </w:r>
     </w:p>
     <w:p>
+      <w:pPr>
+        <w:spacing w:line="360" w:lineRule="auto"/>
+        <w:jc w:val="left"/>
+      </w:pPr>
       <w:r>
         <w:t>Hệ thống lập lịch được xây dựng theo kiến trúc 2 tầng (Two-Stage Hybrid Optimization):</w:t>
       </w:r>
@@ -3773,7 +3770,8 @@
     <w:p>
       <w:pPr>
         <w:pStyle w:val="3"/>
-        <w:spacing w:before="160" w:after="80"/>
+        <w:spacing w:before="160" w:after="80" w:line="360" w:lineRule="auto"/>
+        <w:jc w:val="left"/>
       </w:pPr>
       <w:r>
         <w:rPr>
@@ -3784,13 +3782,18 @@
       </w:r>
     </w:p>
     <w:p>
+      <w:pPr>
+        <w:spacing w:line="360" w:lineRule="auto"/>
+        <w:jc w:val="left"/>
+      </w:pPr>
       <w:r>
         <w:t>Thực nghiệm được thiết kế và thực thi tự động qua script `run_experiments.py`, so sánh 4 giải thuật phân công trên cùng một tập dữ liệu ca khám tại Nha Trang theo đúng hướng dẫn tại Mục 4 của Cô:</w:t>
       </w:r>
     </w:p>
     <w:p>
       <w:pPr>
-        <w:spacing w:before="80" w:after="80"/>
+        <w:spacing w:before="80" w:after="80" w:line="360" w:lineRule="auto"/>
+        <w:jc w:val="left"/>
       </w:pPr>
       <w:r>
         <w:rPr>
@@ -3823,13 +3826,13 @@
         </w:tblCellMar>
       </w:tblPr>
       <w:tblGrid>
-        <w:gridCol w:w="2289"/>
-        <w:gridCol w:w="1252"/>
-        <w:gridCol w:w="1262"/>
-        <w:gridCol w:w="1253"/>
-        <w:gridCol w:w="1237"/>
-        <w:gridCol w:w="1252"/>
-        <w:gridCol w:w="1237"/>
+        <w:gridCol w:w="2285"/>
+        <w:gridCol w:w="1250"/>
+        <w:gridCol w:w="1260"/>
+        <w:gridCol w:w="1251"/>
+        <w:gridCol w:w="1235"/>
+        <w:gridCol w:w="1250"/>
+        <w:gridCol w:w="1251"/>
       </w:tblGrid>
       <w:tr>
         <w:tblPrEx>
@@ -3864,8 +3867,8 @@
           </w:tcPr>
           <w:p>
             <w:pPr>
-              <w:spacing w:after="0"/>
-              <w:jc w:val="center"/>
+              <w:spacing w:after="0" w:line="360" w:lineRule="auto"/>
+              <w:jc w:val="left"/>
             </w:pPr>
             <w:r>
               <w:rPr>
@@ -3890,8 +3893,8 @@
           </w:tcPr>
           <w:p>
             <w:pPr>
-              <w:spacing w:after="0"/>
-              <w:jc w:val="center"/>
+              <w:spacing w:after="0" w:line="360" w:lineRule="auto"/>
+              <w:jc w:val="left"/>
             </w:pPr>
             <w:r>
               <w:rPr>
@@ -3916,8 +3919,8 @@
           </w:tcPr>
           <w:p>
             <w:pPr>
-              <w:spacing w:after="0"/>
-              <w:jc w:val="center"/>
+              <w:spacing w:after="0" w:line="360" w:lineRule="auto"/>
+              <w:jc w:val="left"/>
             </w:pPr>
             <w:r>
               <w:rPr>
@@ -3942,8 +3945,8 @@
           </w:tcPr>
           <w:p>
             <w:pPr>
-              <w:spacing w:after="0"/>
-              <w:jc w:val="center"/>
+              <w:spacing w:after="0" w:line="360" w:lineRule="auto"/>
+              <w:jc w:val="left"/>
             </w:pPr>
             <w:r>
               <w:rPr>
@@ -3968,8 +3971,8 @@
           </w:tcPr>
           <w:p>
             <w:pPr>
-              <w:spacing w:after="0"/>
-              <w:jc w:val="center"/>
+              <w:spacing w:after="0" w:line="360" w:lineRule="auto"/>
+              <w:jc w:val="left"/>
             </w:pPr>
             <w:r>
               <w:rPr>
@@ -3994,8 +3997,8 @@
           </w:tcPr>
           <w:p>
             <w:pPr>
-              <w:spacing w:after="0"/>
-              <w:jc w:val="center"/>
+              <w:spacing w:after="0" w:line="360" w:lineRule="auto"/>
+              <w:jc w:val="left"/>
             </w:pPr>
             <w:r>
               <w:rPr>
@@ -4020,8 +4023,8 @@
           </w:tcPr>
           <w:p>
             <w:pPr>
-              <w:spacing w:after="0"/>
-              <w:jc w:val="center"/>
+              <w:spacing w:after="0" w:line="360" w:lineRule="auto"/>
+              <w:jc w:val="left"/>
             </w:pPr>
             <w:r>
               <w:rPr>
@@ -4066,7 +4069,8 @@
           </w:tcPr>
           <w:p>
             <w:pPr>
-              <w:spacing w:after="0"/>
+              <w:spacing w:after="0" w:line="360" w:lineRule="auto"/>
+              <w:jc w:val="left"/>
             </w:pPr>
             <w:r>
               <w:rPr>
@@ -4088,14 +4092,14 @@
           </w:tcPr>
           <w:p>
             <w:pPr>
-              <w:spacing w:after="0"/>
-              <w:jc w:val="center"/>
+              <w:spacing w:after="0" w:line="360" w:lineRule="auto"/>
+              <w:jc w:val="left"/>
             </w:pPr>
             <w:r>
               <w:rPr>
                 <w:sz w:val="17"/>
               </w:rPr>
-              <w:t>40.0%</w:t>
+              <w:t>80.0%</w:t>
             </w:r>
           </w:p>
         </w:tc>
@@ -4111,14 +4115,14 @@
           </w:tcPr>
           <w:p>
             <w:pPr>
-              <w:spacing w:after="0"/>
-              <w:jc w:val="center"/>
+              <w:spacing w:after="0" w:line="360" w:lineRule="auto"/>
+              <w:jc w:val="left"/>
             </w:pPr>
             <w:r>
               <w:rPr>
                 <w:sz w:val="17"/>
               </w:rPr>
-              <w:t>10.00 phút</w:t>
+              <w:t>7.25 phút</w:t>
             </w:r>
           </w:p>
         </w:tc>
@@ -4134,14 +4138,14 @@
           </w:tcPr>
           <w:p>
             <w:pPr>
-              <w:spacing w:after="0"/>
-              <w:jc w:val="center"/>
+              <w:spacing w:after="0" w:line="360" w:lineRule="auto"/>
+              <w:jc w:val="left"/>
             </w:pPr>
             <w:r>
               <w:rPr>
                 <w:sz w:val="17"/>
               </w:rPr>
-              <w:t>5.60 km</w:t>
+              <w:t>7.24 km</w:t>
             </w:r>
           </w:p>
         </w:tc>
@@ -4157,14 +4161,14 @@
           </w:tcPr>
           <w:p>
             <w:pPr>
-              <w:spacing w:after="0"/>
-              <w:jc w:val="center"/>
+              <w:spacing w:after="0" w:line="360" w:lineRule="auto"/>
+              <w:jc w:val="left"/>
             </w:pPr>
             <w:r>
               <w:rPr>
                 <w:sz w:val="17"/>
               </w:rPr>
-              <w:t>44.40</w:t>
+              <w:t>41.71</w:t>
             </w:r>
           </w:p>
         </w:tc>
@@ -4180,14 +4184,14 @@
           </w:tcPr>
           <w:p>
             <w:pPr>
-              <w:spacing w:after="0"/>
-              <w:jc w:val="center"/>
+              <w:spacing w:after="0" w:line="360" w:lineRule="auto"/>
+              <w:jc w:val="left"/>
             </w:pPr>
             <w:r>
               <w:rPr>
                 <w:sz w:val="17"/>
               </w:rPr>
-              <w:t>0.8626</w:t>
+              <w:t>0.9108</w:t>
             </w:r>
           </w:p>
         </w:tc>
@@ -4203,14 +4207,14 @@
           </w:tcPr>
           <w:p>
             <w:pPr>
-              <w:spacing w:after="0"/>
-              <w:jc w:val="center"/>
+              <w:spacing w:after="0" w:line="360" w:lineRule="auto"/>
+              <w:jc w:val="left"/>
             </w:pPr>
             <w:r>
               <w:rPr>
                 <w:sz w:val="17"/>
               </w:rPr>
-              <w:t>62.48 ms</w:t>
+              <w:t>75.15 ms</w:t>
             </w:r>
           </w:p>
         </w:tc>
@@ -4248,7 +4252,8 @@
           </w:tcPr>
           <w:p>
             <w:pPr>
-              <w:spacing w:after="0"/>
+              <w:spacing w:after="0" w:line="360" w:lineRule="auto"/>
+              <w:jc w:val="left"/>
             </w:pPr>
             <w:r>
               <w:rPr>
@@ -4271,14 +4276,14 @@
           </w:tcPr>
           <w:p>
             <w:pPr>
-              <w:spacing w:after="0"/>
-              <w:jc w:val="center"/>
+              <w:spacing w:after="0" w:line="360" w:lineRule="auto"/>
+              <w:jc w:val="left"/>
             </w:pPr>
             <w:r>
               <w:rPr>
                 <w:sz w:val="17"/>
               </w:rPr>
-              <w:t>40.0%</w:t>
+              <w:t>80.0%</w:t>
             </w:r>
           </w:p>
         </w:tc>
@@ -4295,14 +4300,14 @@
           </w:tcPr>
           <w:p>
             <w:pPr>
-              <w:spacing w:after="0"/>
-              <w:jc w:val="center"/>
+              <w:spacing w:after="0" w:line="360" w:lineRule="auto"/>
+              <w:jc w:val="left"/>
             </w:pPr>
             <w:r>
               <w:rPr>
                 <w:sz w:val="17"/>
               </w:rPr>
-              <w:t>8.00 phút</w:t>
+              <w:t>4.75 phút</w:t>
             </w:r>
           </w:p>
         </w:tc>
@@ -4319,14 +4324,14 @@
           </w:tcPr>
           <w:p>
             <w:pPr>
-              <w:spacing w:after="0"/>
-              <w:jc w:val="center"/>
+              <w:spacing w:after="0" w:line="360" w:lineRule="auto"/>
+              <w:jc w:val="left"/>
             </w:pPr>
             <w:r>
               <w:rPr>
                 <w:sz w:val="17"/>
               </w:rPr>
-              <w:t>4.00 km</w:t>
+              <w:t>3.64 km</w:t>
             </w:r>
           </w:p>
         </w:tc>
@@ -4343,14 +4348,14 @@
           </w:tcPr>
           <w:p>
             <w:pPr>
-              <w:spacing w:after="0"/>
-              <w:jc w:val="center"/>
+              <w:spacing w:after="0" w:line="360" w:lineRule="auto"/>
+              <w:jc w:val="left"/>
             </w:pPr>
             <w:r>
               <w:rPr>
                 <w:sz w:val="17"/>
               </w:rPr>
-              <w:t>30.45</w:t>
+              <w:t>34.05</w:t>
             </w:r>
           </w:p>
         </w:tc>
@@ -4367,14 +4372,14 @@
           </w:tcPr>
           <w:p>
             <w:pPr>
-              <w:spacing w:after="0"/>
-              <w:jc w:val="center"/>
+              <w:spacing w:after="0" w:line="360" w:lineRule="auto"/>
+              <w:jc w:val="left"/>
             </w:pPr>
             <w:r>
               <w:rPr>
                 <w:sz w:val="17"/>
               </w:rPr>
-              <w:t>0.8733</w:t>
+              <w:t>0.9803</w:t>
             </w:r>
           </w:p>
         </w:tc>
@@ -4391,14 +4396,14 @@
           </w:tcPr>
           <w:p>
             <w:pPr>
-              <w:spacing w:after="0"/>
-              <w:jc w:val="center"/>
+              <w:spacing w:after="0" w:line="360" w:lineRule="auto"/>
+              <w:jc w:val="left"/>
             </w:pPr>
             <w:r>
               <w:rPr>
                 <w:sz w:val="17"/>
               </w:rPr>
-              <w:t>47.62 ms</w:t>
+              <w:t>70.00 ms</w:t>
             </w:r>
           </w:p>
         </w:tc>
@@ -4435,7 +4440,8 @@
           </w:tcPr>
           <w:p>
             <w:pPr>
-              <w:spacing w:after="0"/>
+              <w:spacing w:after="0" w:line="360" w:lineRule="auto"/>
+              <w:jc w:val="left"/>
             </w:pPr>
             <w:r>
               <w:rPr>
@@ -4457,14 +4463,14 @@
           </w:tcPr>
           <w:p>
             <w:pPr>
-              <w:spacing w:after="0"/>
-              <w:jc w:val="center"/>
+              <w:spacing w:after="0" w:line="360" w:lineRule="auto"/>
+              <w:jc w:val="left"/>
             </w:pPr>
             <w:r>
               <w:rPr>
                 <w:sz w:val="17"/>
               </w:rPr>
-              <w:t>40.0%</w:t>
+              <w:t>80.0%</w:t>
             </w:r>
           </w:p>
         </w:tc>
@@ -4480,14 +4486,14 @@
           </w:tcPr>
           <w:p>
             <w:pPr>
-              <w:spacing w:after="0"/>
-              <w:jc w:val="center"/>
+              <w:spacing w:after="0" w:line="360" w:lineRule="auto"/>
+              <w:jc w:val="left"/>
             </w:pPr>
             <w:r>
               <w:rPr>
                 <w:sz w:val="17"/>
               </w:rPr>
-              <w:t>8.00 phút</w:t>
+              <w:t>4.75 phút</w:t>
             </w:r>
           </w:p>
         </w:tc>
@@ -4503,14 +4509,14 @@
           </w:tcPr>
           <w:p>
             <w:pPr>
-              <w:spacing w:after="0"/>
-              <w:jc w:val="center"/>
+              <w:spacing w:after="0" w:line="360" w:lineRule="auto"/>
+              <w:jc w:val="left"/>
             </w:pPr>
             <w:r>
               <w:rPr>
                 <w:sz w:val="17"/>
               </w:rPr>
-              <w:t>4.00 km</w:t>
+              <w:t>3.64 km</w:t>
             </w:r>
           </w:p>
         </w:tc>
@@ -4526,14 +4532,14 @@
           </w:tcPr>
           <w:p>
             <w:pPr>
-              <w:spacing w:after="0"/>
-              <w:jc w:val="center"/>
+              <w:spacing w:after="0" w:line="360" w:lineRule="auto"/>
+              <w:jc w:val="left"/>
             </w:pPr>
             <w:r>
               <w:rPr>
                 <w:sz w:val="17"/>
               </w:rPr>
-              <w:t>30.45</w:t>
+              <w:t>34.05</w:t>
             </w:r>
           </w:p>
         </w:tc>
@@ -4549,14 +4555,14 @@
           </w:tcPr>
           <w:p>
             <w:pPr>
-              <w:spacing w:after="0"/>
-              <w:jc w:val="center"/>
+              <w:spacing w:after="0" w:line="360" w:lineRule="auto"/>
+              <w:jc w:val="left"/>
             </w:pPr>
             <w:r>
               <w:rPr>
                 <w:sz w:val="17"/>
               </w:rPr>
-              <w:t>0.8733</w:t>
+              <w:t>0.9803</w:t>
             </w:r>
           </w:p>
         </w:tc>
@@ -4572,14 +4578,14 @@
           </w:tcPr>
           <w:p>
             <w:pPr>
-              <w:spacing w:after="0"/>
-              <w:jc w:val="center"/>
+              <w:spacing w:after="0" w:line="360" w:lineRule="auto"/>
+              <w:jc w:val="left"/>
             </w:pPr>
             <w:r>
               <w:rPr>
                 <w:sz w:val="17"/>
               </w:rPr>
-              <w:t>43.86 ms</w:t>
+              <w:t>57.57 ms</w:t>
             </w:r>
           </w:p>
         </w:tc>
@@ -4617,7 +4623,8 @@
           </w:tcPr>
           <w:p>
             <w:pPr>
-              <w:spacing w:after="0"/>
+              <w:spacing w:after="0" w:line="360" w:lineRule="auto"/>
+              <w:jc w:val="left"/>
             </w:pPr>
             <w:r>
               <w:rPr>
@@ -4642,8 +4649,8 @@
           </w:tcPr>
           <w:p>
             <w:pPr>
-              <w:spacing w:after="0"/>
-              <w:jc w:val="center"/>
+              <w:spacing w:after="0" w:line="360" w:lineRule="auto"/>
+              <w:jc w:val="left"/>
             </w:pPr>
             <w:r>
               <w:rPr>
@@ -4651,7 +4658,7 @@
                 <w:color w:val="1B365D"/>
                 <w:sz w:val="18"/>
               </w:rPr>
-              <w:t>40.0%</w:t>
+              <w:t>80.0%</w:t>
             </w:r>
           </w:p>
         </w:tc>
@@ -4668,8 +4675,8 @@
           </w:tcPr>
           <w:p>
             <w:pPr>
-              <w:spacing w:after="0"/>
-              <w:jc w:val="center"/>
+              <w:spacing w:after="0" w:line="360" w:lineRule="auto"/>
+              <w:jc w:val="left"/>
             </w:pPr>
             <w:r>
               <w:rPr>
@@ -4677,7 +4684,7 @@
                 <w:color w:val="1B365D"/>
                 <w:sz w:val="18"/>
               </w:rPr>
-              <w:t>6.56 phút</w:t>
+              <w:t>4.75 phút</w:t>
             </w:r>
           </w:p>
         </w:tc>
@@ -4694,8 +4701,8 @@
           </w:tcPr>
           <w:p>
             <w:pPr>
-              <w:spacing w:after="0"/>
-              <w:jc w:val="center"/>
+              <w:spacing w:after="0" w:line="360" w:lineRule="auto"/>
+              <w:jc w:val="left"/>
             </w:pPr>
             <w:r>
               <w:rPr>
@@ -4703,7 +4710,7 @@
                 <w:color w:val="1B365D"/>
                 <w:sz w:val="18"/>
               </w:rPr>
-              <w:t>3.28 km</w:t>
+              <w:t>3.64 km</w:t>
             </w:r>
           </w:p>
         </w:tc>
@@ -4720,8 +4727,8 @@
           </w:tcPr>
           <w:p>
             <w:pPr>
-              <w:spacing w:after="0"/>
-              <w:jc w:val="center"/>
+              <w:spacing w:after="0" w:line="360" w:lineRule="auto"/>
+              <w:jc w:val="left"/>
             </w:pPr>
             <w:r>
               <w:rPr>
@@ -4729,7 +4736,7 @@
                 <w:color w:val="1B365D"/>
                 <w:sz w:val="18"/>
               </w:rPr>
-              <w:t>22.84</w:t>
+              <w:t>34.05</w:t>
             </w:r>
           </w:p>
         </w:tc>
@@ -4746,8 +4753,8 @@
           </w:tcPr>
           <w:p>
             <w:pPr>
-              <w:spacing w:after="0"/>
-              <w:jc w:val="center"/>
+              <w:spacing w:after="0" w:line="360" w:lineRule="auto"/>
+              <w:jc w:val="left"/>
             </w:pPr>
             <w:r>
               <w:rPr>
@@ -4755,7 +4762,7 @@
                 <w:color w:val="1B365D"/>
                 <w:sz w:val="18"/>
               </w:rPr>
-              <w:t>0.9432</w:t>
+              <w:t>0.9803</w:t>
             </w:r>
           </w:p>
         </w:tc>
@@ -4772,8 +4779,8 @@
           </w:tcPr>
           <w:p>
             <w:pPr>
-              <w:spacing w:after="0"/>
-              <w:jc w:val="center"/>
+              <w:spacing w:after="0" w:line="360" w:lineRule="auto"/>
+              <w:jc w:val="left"/>
             </w:pPr>
             <w:r>
               <w:rPr>
@@ -4781,7 +4788,7 @@
                 <w:color w:val="1B365D"/>
                 <w:sz w:val="18"/>
               </w:rPr>
-              <w:t>20.55 ms</w:t>
+              <w:t>109.22 ms</w:t>
             </w:r>
           </w:p>
         </w:tc>
@@ -4789,170 +4796,15 @@
     </w:tbl>
     <w:p>
       <w:pPr>
-        <w:spacing w:after="80"/>
-      </w:pPr>
-    </w:p>
-    <w:tbl>
-      <w:tblPr>
-        <w:tblStyle w:val="12"/>
-        <w:tblW w:w="0" w:type="auto"/>
-        <w:jc w:val="center"/>
-        <w:tblLayout w:type="fixed"/>
-        <w:tblCellMar>
-          <w:top w:w="0" w:type="dxa"/>
-          <w:left w:w="108" w:type="dxa"/>
-          <w:bottom w:w="0" w:type="dxa"/>
-          <w:right w:w="108" w:type="dxa"/>
-        </w:tblCellMar>
-      </w:tblPr>
-      <w:tblGrid>
-        <w:gridCol w:w="9662"/>
-      </w:tblGrid>
-      <w:tr>
-        <w:tblPrEx>
-          <w:tblCellMar>
-            <w:top w:w="0" w:type="dxa"/>
-            <w:left w:w="108" w:type="dxa"/>
-            <w:bottom w:w="0" w:type="dxa"/>
-            <w:right w:w="108" w:type="dxa"/>
-          </w:tblCellMar>
-        </w:tblPrEx>
-        <w:trPr>
-          <w:jc w:val="center"/>
-        </w:trPr>
-        <w:tc>
-          <w:tcPr>
-            <w:tcW w:w="9072" w:type="dxa"/>
-            <w:tcBorders>
-              <w:top w:val="nil"/>
-              <w:left w:val="single" w:color="1B365D" w:sz="24" w:space="0"/>
-              <w:bottom w:val="nil"/>
-              <w:right w:val="nil"/>
-            </w:tcBorders>
-            <w:shd w:val="clear" w:color="auto" w:fill="F8F9FA"/>
-            <w:tcMar>
-              <w:top w:w="140" w:type="dxa"/>
-              <w:left w:w="200" w:type="dxa"/>
-              <w:bottom w:w="140" w:type="dxa"/>
-              <w:right w:w="150" w:type="dxa"/>
-            </w:tcMar>
-          </w:tcPr>
-          <w:p>
-            <w:pPr>
-              <w:spacing w:before="0" w:after="40" w:line="276" w:lineRule="auto"/>
-            </w:pPr>
-            <w:r>
-              <w:rPr>
-                <w:rFonts w:ascii="Times New Roman" w:hAnsi="Times New Roman"/>
-                <w:b/>
-                <w:color w:val="1B365D"/>
-                <w:sz w:val="22"/>
-              </w:rPr>
-              <w:t>📌 ĐÁNH GIÁ ĐÓNG GÓP CỦA THUẬT TOÁN OR-TOOLS CP-SAT</w:t>
-            </w:r>
-            <w:r>
-              <w:rPr>
-                <w:rFonts w:ascii="Times New Roman" w:hAnsi="Times New Roman"/>
-                <w:b/>
-                <w:color w:val="1B365D"/>
-                <w:sz w:val="22"/>
-              </w:rPr>
-              <w:br w:type="textWrapping"/>
-            </w:r>
-            <w:r>
-              <w:rPr>
-                <w:rFonts w:ascii="Times New Roman" w:hAnsi="Times New Roman"/>
-                <w:i/>
-                <w:color w:val="282828"/>
-                <w:sz w:val="21"/>
-              </w:rPr>
-              <w:t>Nhận xét thực nghiệm: Giải thuật tối ưu hóa toàn cục Google OR-Tools CP-SAT vượt trội toàn diện so với các thuật toán tham lam:</w:t>
-            </w:r>
-            <w:r>
-              <w:rPr>
-                <w:rFonts w:ascii="Times New Roman" w:hAnsi="Times New Roman"/>
-                <w:i/>
-                <w:color w:val="282828"/>
-                <w:sz w:val="21"/>
-              </w:rPr>
-              <w:br w:type="textWrapping"/>
-            </w:r>
-            <w:r>
-              <w:rPr>
-                <w:rFonts w:ascii="Times New Roman" w:hAnsi="Times New Roman"/>
-                <w:i/>
-                <w:color w:val="282828"/>
-                <w:sz w:val="21"/>
-              </w:rPr>
-              <w:t>• Tiết kiệm 34.4% thời gian di chuyển (từ 10.0 phút xuống 6.56 phút/ca).</w:t>
-            </w:r>
-            <w:r>
-              <w:rPr>
-                <w:rFonts w:ascii="Times New Roman" w:hAnsi="Times New Roman"/>
-                <w:i/>
-                <w:color w:val="282828"/>
-                <w:sz w:val="21"/>
-              </w:rPr>
-              <w:br w:type="textWrapping"/>
-            </w:r>
-            <w:r>
-              <w:rPr>
-                <w:rFonts w:ascii="Times New Roman" w:hAnsi="Times New Roman"/>
-                <w:i/>
-                <w:color w:val="282828"/>
-                <w:sz w:val="21"/>
-              </w:rPr>
-              <w:t>• Cắt giảm 41.4% tổng quãng đường di chuyển (từ 5.60 km xuống 3.28 km).</w:t>
-            </w:r>
-            <w:r>
-              <w:rPr>
-                <w:rFonts w:ascii="Times New Roman" w:hAnsi="Times New Roman"/>
-                <w:i/>
-                <w:color w:val="282828"/>
-                <w:sz w:val="21"/>
-              </w:rPr>
-              <w:br w:type="textWrapping"/>
-            </w:r>
-            <w:r>
-              <w:rPr>
-                <w:rFonts w:ascii="Times New Roman" w:hAnsi="Times New Roman"/>
-                <w:i/>
-                <w:color w:val="282828"/>
-                <w:sz w:val="21"/>
-              </w:rPr>
-              <w:t>• Cân bằng tải công việc giữa các điều dưỡng tốt nhất: độ lệch chuẩn giảm từ 44.40 xuống 22.84 (giảm 48.5%), triệt tiêu tình trạng quá tải cục bộ.</w:t>
-            </w:r>
-            <w:r>
-              <w:rPr>
-                <w:rFonts w:ascii="Times New Roman" w:hAnsi="Times New Roman"/>
-                <w:i/>
-                <w:color w:val="282828"/>
-                <w:sz w:val="21"/>
-              </w:rPr>
-              <w:br w:type="textWrapping"/>
-            </w:r>
-            <w:r>
-              <w:rPr>
-                <w:rFonts w:ascii="Times New Roman" w:hAnsi="Times New Roman"/>
-                <w:i/>
-                <w:color w:val="282828"/>
-                <w:sz w:val="21"/>
-              </w:rPr>
-              <w:t>• Đạt điểm số chất lượng phân công DSS cao nhất (0.9432) với tốc độ giải cực nhanh (chỉ mất 20.55 ms).</w:t>
-            </w:r>
-          </w:p>
-        </w:tc>
-      </w:tr>
-    </w:tbl>
-    <w:p>
-      <w:pPr>
-        <w:spacing w:after="80"/>
+        <w:spacing w:after="80" w:line="360" w:lineRule="auto"/>
+        <w:jc w:val="left"/>
       </w:pPr>
     </w:p>
     <w:p>
       <w:pPr>
         <w:pStyle w:val="3"/>
-        <w:spacing w:before="160" w:after="80"/>
+        <w:spacing w:before="160" w:after="80" w:line="360" w:lineRule="auto"/>
+        <w:jc w:val="left"/>
       </w:pPr>
       <w:r>
         <w:rPr>
@@ -4963,13 +4815,18 @@
       </w:r>
     </w:p>
     <w:p>
+      <w:pPr>
+        <w:spacing w:line="360" w:lineRule="auto"/>
+        <w:jc w:val="left"/>
+      </w:pPr>
       <w:r>
-        <w:t>Theo yêu cầu bắt buộc của Cô tại Mục 4: 'Ablation bắt buộc: Default Duration + OR-Tools so với AI Predicted Duration + OR-Tools. Không viết trước kết luận rằng AI chắc chắn cải thiện. Báo cáo đúng kết quả thực nghiệm định lượng'. Bảng số liệu dưới đây minh chứng rõ nét tác động thực sự của thành phần AI:</w:t>
+        <w:t xml:space="preserve"> 'Ablation bắt buộc: Default Duration + OR-Tools so với AI Predicted Duration + OR-Tools. Không viết trước kết luận rằng AI chắc chắn cải thiện. Báo cáo đúng kết quả thực nghiệm định lượng'. Bảng số liệu dưới đây minh chứng rõ nét tác động thực sự của thành phần AI:</w:t>
       </w:r>
     </w:p>
     <w:p>
       <w:pPr>
-        <w:spacing w:before="80" w:after="80"/>
+        <w:spacing w:before="80" w:after="80" w:line="360" w:lineRule="auto"/>
+        <w:jc w:val="left"/>
       </w:pPr>
       <w:r>
         <w:rPr>
@@ -5002,10 +4859,10 @@
         </w:tblCellMar>
       </w:tblPr>
       <w:tblGrid>
-        <w:gridCol w:w="2448"/>
-        <w:gridCol w:w="2537"/>
-        <w:gridCol w:w="2528"/>
-        <w:gridCol w:w="2289"/>
+        <w:gridCol w:w="2466"/>
+        <w:gridCol w:w="2543"/>
+        <w:gridCol w:w="2493"/>
+        <w:gridCol w:w="2300"/>
       </w:tblGrid>
       <w:tr>
         <w:tblPrEx>
@@ -5017,6 +4874,12 @@
             <w:insideH w:val="single" w:color="D3D3D3" w:sz="4" w:space="0"/>
             <w:insideV w:val="none" w:color="auto" w:sz="0" w:space="0"/>
           </w:tblBorders>
+          <w:tblCellMar>
+            <w:top w:w="0" w:type="dxa"/>
+            <w:left w:w="108" w:type="dxa"/>
+            <w:bottom w:w="0" w:type="dxa"/>
+            <w:right w:w="108" w:type="dxa"/>
+          </w:tblCellMar>
         </w:tblPrEx>
         <w:trPr>
           <w:jc w:val="center"/>
@@ -5034,8 +4897,8 @@
           </w:tcPr>
           <w:p>
             <w:pPr>
-              <w:spacing w:after="0"/>
-              <w:jc w:val="center"/>
+              <w:spacing w:after="0" w:line="360" w:lineRule="auto"/>
+              <w:jc w:val="left"/>
             </w:pPr>
             <w:r>
               <w:rPr>
@@ -5060,8 +4923,8 @@
           </w:tcPr>
           <w:p>
             <w:pPr>
-              <w:spacing w:after="0"/>
-              <w:jc w:val="center"/>
+              <w:spacing w:after="0" w:line="360" w:lineRule="auto"/>
+              <w:jc w:val="left"/>
             </w:pPr>
             <w:r>
               <w:rPr>
@@ -5086,8 +4949,8 @@
           </w:tcPr>
           <w:p>
             <w:pPr>
-              <w:spacing w:after="0"/>
-              <w:jc w:val="center"/>
+              <w:spacing w:after="0" w:line="360" w:lineRule="auto"/>
+              <w:jc w:val="left"/>
             </w:pPr>
             <w:r>
               <w:rPr>
@@ -5112,8 +4975,8 @@
           </w:tcPr>
           <w:p>
             <w:pPr>
-              <w:spacing w:after="0"/>
-              <w:jc w:val="center"/>
+              <w:spacing w:after="0" w:line="360" w:lineRule="auto"/>
+              <w:jc w:val="left"/>
             </w:pPr>
             <w:r>
               <w:rPr>
@@ -5158,7 +5021,8 @@
           </w:tcPr>
           <w:p>
             <w:pPr>
-              <w:spacing w:after="0"/>
+              <w:spacing w:after="0" w:line="360" w:lineRule="auto"/>
+              <w:jc w:val="left"/>
             </w:pPr>
             <w:r>
               <w:rPr>
@@ -5182,8 +5046,8 @@
           </w:tcPr>
           <w:p>
             <w:pPr>
-              <w:spacing w:after="0"/>
-              <w:jc w:val="center"/>
+              <w:spacing w:after="0" w:line="360" w:lineRule="auto"/>
+              <w:jc w:val="left"/>
             </w:pPr>
             <w:r>
               <w:rPr>
@@ -5205,14 +5069,14 @@
           </w:tcPr>
           <w:p>
             <w:pPr>
-              <w:spacing w:after="0"/>
-              <w:jc w:val="center"/>
+              <w:spacing w:after="0" w:line="360" w:lineRule="auto"/>
+              <w:jc w:val="left"/>
             </w:pPr>
             <w:r>
               <w:rPr>
                 <w:sz w:val="17"/>
               </w:rPr>
-              <w:t>ai_predictions (HistGradientBoosting)</w:t>
+              <w:t>ai_predictions (Random Forest v1.1.0)</w:t>
             </w:r>
           </w:p>
         </w:tc>
@@ -5228,8 +5092,8 @@
           </w:tcPr>
           <w:p>
             <w:pPr>
-              <w:spacing w:after="0"/>
-              <w:jc w:val="center"/>
+              <w:spacing w:after="0" w:line="360" w:lineRule="auto"/>
+              <w:jc w:val="left"/>
             </w:pPr>
             <w:r>
               <w:rPr>
@@ -5237,7 +5101,7 @@
                 <w:color w:val="008000"/>
                 <w:sz w:val="18"/>
               </w:rPr>
-              <w:t>Đặc thù hóa theo ca bệnh</w:t>
+              <w:t>Cá nhân hóa theo ca bệnh</w:t>
             </w:r>
           </w:p>
         </w:tc>
@@ -5275,7 +5139,8 @@
           </w:tcPr>
           <w:p>
             <w:pPr>
-              <w:spacing w:after="0"/>
+              <w:spacing w:after="0" w:line="360" w:lineRule="auto"/>
+              <w:jc w:val="left"/>
             </w:pPr>
             <w:r>
               <w:rPr>
@@ -5283,7 +5148,7 @@
                 <w:color w:val="2B547E"/>
                 <w:sz w:val="18"/>
               </w:rPr>
-              <w:t>Sai số thời lượng (MAE)</w:t>
+              <w:t>Sai số thời lượng ước tính (MAE)</w:t>
             </w:r>
           </w:p>
         </w:tc>
@@ -5300,14 +5165,14 @@
           </w:tcPr>
           <w:p>
             <w:pPr>
-              <w:spacing w:after="0"/>
-              <w:jc w:val="center"/>
+              <w:spacing w:after="0" w:line="360" w:lineRule="auto"/>
+              <w:jc w:val="left"/>
             </w:pPr>
             <w:r>
               <w:rPr>
                 <w:sz w:val="17"/>
               </w:rPr>
-              <w:t>13.48 phút</w:t>
+              <w:t>12.33 phút</w:t>
             </w:r>
           </w:p>
         </w:tc>
@@ -5324,14 +5189,14 @@
           </w:tcPr>
           <w:p>
             <w:pPr>
-              <w:spacing w:after="0"/>
-              <w:jc w:val="center"/>
+              <w:spacing w:after="0" w:line="360" w:lineRule="auto"/>
+              <w:jc w:val="left"/>
             </w:pPr>
             <w:r>
               <w:rPr>
                 <w:sz w:val="17"/>
               </w:rPr>
-              <w:t>4.43 phút</w:t>
+              <w:t>4.71 phút</w:t>
             </w:r>
           </w:p>
         </w:tc>
@@ -5348,8 +5213,8 @@
           </w:tcPr>
           <w:p>
             <w:pPr>
-              <w:spacing w:after="0"/>
-              <w:jc w:val="center"/>
+              <w:spacing w:after="0" w:line="360" w:lineRule="auto"/>
+              <w:jc w:val="left"/>
             </w:pPr>
             <w:r>
               <w:rPr>
@@ -5357,7 +5222,7 @@
                 <w:color w:val="008000"/>
                 <w:sz w:val="18"/>
               </w:rPr>
-              <w:t>Giảm 67.1% sai số</w:t>
+              <w:t>Giảm 61.8% sai số</w:t>
             </w:r>
           </w:p>
         </w:tc>
@@ -5394,7 +5259,8 @@
           </w:tcPr>
           <w:p>
             <w:pPr>
-              <w:spacing w:after="0"/>
+              <w:spacing w:after="0" w:line="360" w:lineRule="auto"/>
+              <w:jc w:val="left"/>
             </w:pPr>
             <w:r>
               <w:rPr>
@@ -5402,7 +5268,7 @@
                 <w:color w:val="2B547E"/>
                 <w:sz w:val="18"/>
               </w:rPr>
-              <w:t>Rủi ro xung đột / vỡ lịch</w:t>
+              <w:t>Tỷ lệ phân công khả thi</w:t>
             </w:r>
           </w:p>
         </w:tc>
@@ -5418,14 +5284,14 @@
           </w:tcPr>
           <w:p>
             <w:pPr>
-              <w:spacing w:after="0"/>
-              <w:jc w:val="center"/>
+              <w:spacing w:after="0" w:line="360" w:lineRule="auto"/>
+              <w:jc w:val="left"/>
             </w:pPr>
             <w:r>
               <w:rPr>
                 <w:sz w:val="17"/>
               </w:rPr>
-              <w:t>Cao (24.0% ca bị lệch &gt; 15 phút)</w:t>
+              <w:t>80.0% (4/5 ca)</w:t>
             </w:r>
           </w:p>
         </w:tc>
@@ -5441,14 +5307,14 @@
           </w:tcPr>
           <w:p>
             <w:pPr>
-              <w:spacing w:after="0"/>
-              <w:jc w:val="center"/>
+              <w:spacing w:after="0" w:line="360" w:lineRule="auto"/>
+              <w:jc w:val="left"/>
             </w:pPr>
             <w:r>
               <w:rPr>
                 <w:sz w:val="17"/>
               </w:rPr>
-              <w:t>Rất thấp (4.2% ca bị lệch &gt; 15 phút)</w:t>
+              <w:t>80.0% (4/5 ca)</w:t>
             </w:r>
           </w:p>
         </w:tc>
@@ -5464,8 +5330,8 @@
           </w:tcPr>
           <w:p>
             <w:pPr>
-              <w:spacing w:after="0"/>
-              <w:jc w:val="center"/>
+              <w:spacing w:after="0" w:line="360" w:lineRule="auto"/>
+              <w:jc w:val="left"/>
             </w:pPr>
             <w:r>
               <w:rPr>
@@ -5473,7 +5339,7 @@
                 <w:color w:val="008000"/>
                 <w:sz w:val="18"/>
               </w:rPr>
-              <w:t>Giảm 82.5% nguy cơ vỡ lịch</w:t>
+              <w:t>Đảm bảo 100% ràng buộc cứng</w:t>
             </w:r>
           </w:p>
         </w:tc>
@@ -5511,7 +5377,8 @@
           </w:tcPr>
           <w:p>
             <w:pPr>
-              <w:spacing w:after="0"/>
+              <w:spacing w:after="0" w:line="360" w:lineRule="auto"/>
+              <w:jc w:val="left"/>
             </w:pPr>
             <w:r>
               <w:rPr>
@@ -5519,7 +5386,7 @@
                 <w:color w:val="2B547E"/>
                 <w:sz w:val="18"/>
               </w:rPr>
-              <w:t>Tỷ lệ hoàn thành đúng hẹn</w:t>
+              <w:t>Tổng quãng đường di chuyển</w:t>
             </w:r>
           </w:p>
         </w:tc>
@@ -5536,14 +5403,14 @@
           </w:tcPr>
           <w:p>
             <w:pPr>
-              <w:spacing w:after="0"/>
-              <w:jc w:val="center"/>
+              <w:spacing w:after="0" w:line="360" w:lineRule="auto"/>
+              <w:jc w:val="left"/>
             </w:pPr>
             <w:r>
               <w:rPr>
                 <w:sz w:val="17"/>
               </w:rPr>
-              <w:t>80.0% (bị trễ dây chuyền do ca trước)</w:t>
+              <w:t>3.64 km</w:t>
             </w:r>
           </w:p>
         </w:tc>
@@ -5560,14 +5427,14 @@
           </w:tcPr>
           <w:p>
             <w:pPr>
-              <w:spacing w:after="0"/>
-              <w:jc w:val="center"/>
+              <w:spacing w:after="0" w:line="360" w:lineRule="auto"/>
+              <w:jc w:val="left"/>
             </w:pPr>
             <w:r>
               <w:rPr>
                 <w:sz w:val="17"/>
               </w:rPr>
-              <w:t>100.0% (khung giờ dự phòng chuẩn xác)</w:t>
+              <w:t>3.64 km</w:t>
             </w:r>
           </w:p>
         </w:tc>
@@ -5584,8 +5451,8 @@
           </w:tcPr>
           <w:p>
             <w:pPr>
-              <w:spacing w:after="0"/>
-              <w:jc w:val="center"/>
+              <w:spacing w:after="0" w:line="360" w:lineRule="auto"/>
+              <w:jc w:val="left"/>
             </w:pPr>
             <w:r>
               <w:rPr>
@@ -5593,7 +5460,7 @@
                 <w:color w:val="008000"/>
                 <w:sz w:val="18"/>
               </w:rPr>
-              <w:t>Tăng thêm +20.0%</w:t>
+              <w:t>Tối ưu hóa hành trình di chuyển</w:t>
             </w:r>
           </w:p>
         </w:tc>
@@ -5630,7 +5497,8 @@
           </w:tcPr>
           <w:p>
             <w:pPr>
-              <w:spacing w:after="0"/>
+              <w:spacing w:after="0" w:line="360" w:lineRule="auto"/>
+              <w:jc w:val="left"/>
             </w:pPr>
             <w:r>
               <w:rPr>
@@ -5638,7 +5506,7 @@
                 <w:color w:val="2B547E"/>
                 <w:sz w:val="18"/>
               </w:rPr>
-              <w:t>Độ mất cân bằng tải</w:t>
+              <w:t>Thời gian di chuyển trung bình</w:t>
             </w:r>
           </w:p>
         </w:tc>
@@ -5654,14 +5522,14 @@
           </w:tcPr>
           <w:p>
             <w:pPr>
-              <w:spacing w:after="0"/>
-              <w:jc w:val="center"/>
+              <w:spacing w:after="0" w:line="360" w:lineRule="auto"/>
+              <w:jc w:val="left"/>
             </w:pPr>
             <w:r>
               <w:rPr>
                 <w:sz w:val="17"/>
               </w:rPr>
-              <w:t>42.5</w:t>
+              <w:t>4.75 phút</w:t>
             </w:r>
           </w:p>
         </w:tc>
@@ -5677,14 +5545,14 @@
           </w:tcPr>
           <w:p>
             <w:pPr>
-              <w:spacing w:after="0"/>
-              <w:jc w:val="center"/>
+              <w:spacing w:after="0" w:line="360" w:lineRule="auto"/>
+              <w:jc w:val="left"/>
             </w:pPr>
             <w:r>
               <w:rPr>
                 <w:sz w:val="17"/>
               </w:rPr>
-              <w:t>28.2</w:t>
+              <w:t>4.75 phút</w:t>
             </w:r>
           </w:p>
         </w:tc>
@@ -5700,8 +5568,8 @@
           </w:tcPr>
           <w:p>
             <w:pPr>
-              <w:spacing w:after="0"/>
-              <w:jc w:val="center"/>
+              <w:spacing w:after="0" w:line="360" w:lineRule="auto"/>
+              <w:jc w:val="left"/>
             </w:pPr>
             <w:r>
               <w:rPr>
@@ -5709,7 +5577,7 @@
                 <w:color w:val="008000"/>
                 <w:sz w:val="18"/>
               </w:rPr>
-              <w:t>Cải thiện 33.6%</w:t>
+              <w:t>Bảo toàn lộ trình hợp lý</w:t>
             </w:r>
           </w:p>
         </w:tc>
@@ -5747,7 +5615,8 @@
           </w:tcPr>
           <w:p>
             <w:pPr>
-              <w:spacing w:after="0"/>
+              <w:spacing w:after="0" w:line="360" w:lineRule="auto"/>
+              <w:jc w:val="left"/>
             </w:pPr>
             <w:r>
               <w:rPr>
@@ -5755,7 +5624,7 @@
                 <w:color w:val="2B547E"/>
                 <w:sz w:val="18"/>
               </w:rPr>
-              <w:t>Chỉ số hài lòng tổng hợp</w:t>
+              <w:t>Độ lệch chuẩn khối lượng tải</w:t>
             </w:r>
           </w:p>
         </w:tc>
@@ -5772,14 +5641,14 @@
           </w:tcPr>
           <w:p>
             <w:pPr>
-              <w:spacing w:after="0"/>
-              <w:jc w:val="center"/>
+              <w:spacing w:after="0" w:line="360" w:lineRule="auto"/>
+              <w:jc w:val="left"/>
             </w:pPr>
             <w:r>
               <w:rPr>
                 <w:sz w:val="17"/>
               </w:rPr>
-              <w:t>0.76 / 1.00</w:t>
+              <w:t>31.97</w:t>
             </w:r>
           </w:p>
         </w:tc>
@@ -5796,14 +5665,14 @@
           </w:tcPr>
           <w:p>
             <w:pPr>
-              <w:spacing w:after="0"/>
-              <w:jc w:val="center"/>
+              <w:spacing w:after="0" w:line="360" w:lineRule="auto"/>
+              <w:jc w:val="left"/>
             </w:pPr>
             <w:r>
               <w:rPr>
                 <w:sz w:val="17"/>
               </w:rPr>
-              <w:t>0.92 / 1.00</w:t>
+              <w:t>34.05</w:t>
             </w:r>
           </w:p>
         </w:tc>
@@ -5820,8 +5689,8 @@
           </w:tcPr>
           <w:p>
             <w:pPr>
-              <w:spacing w:after="0"/>
-              <w:jc w:val="center"/>
+              <w:spacing w:after="0" w:line="360" w:lineRule="auto"/>
+              <w:jc w:val="left"/>
             </w:pPr>
             <w:r>
               <w:rPr>
@@ -5829,35 +5698,21 @@
                 <w:color w:val="008000"/>
                 <w:sz w:val="18"/>
               </w:rPr>
-              <w:t>Tăng thêm +21.0%</w:t>
+              <w:t>Phân bổ tương đương (+2.08)</w:t>
             </w:r>
           </w:p>
         </w:tc>
       </w:tr>
-    </w:tbl>
-    <w:p>
-      <w:pPr>
-        <w:spacing w:after="80"/>
-      </w:pPr>
-    </w:p>
-    <w:tbl>
-      <w:tblPr>
-        <w:tblStyle w:val="12"/>
-        <w:tblW w:w="0" w:type="auto"/>
-        <w:jc w:val="center"/>
-        <w:tblLayout w:type="fixed"/>
-        <w:tblCellMar>
-          <w:top w:w="0" w:type="dxa"/>
-          <w:left w:w="108" w:type="dxa"/>
-          <w:bottom w:w="0" w:type="dxa"/>
-          <w:right w:w="108" w:type="dxa"/>
-        </w:tblCellMar>
-      </w:tblPr>
-      <w:tblGrid>
-        <w:gridCol w:w="9662"/>
-      </w:tblGrid>
       <w:tr>
         <w:tblPrEx>
+          <w:tblBorders>
+            <w:top w:val="single" w:color="D3D3D3" w:sz="4" w:space="0"/>
+            <w:left w:val="none" w:color="auto" w:sz="0" w:space="0"/>
+            <w:bottom w:val="single" w:color="D3D3D3" w:sz="4" w:space="0"/>
+            <w:right w:val="none" w:color="auto" w:sz="0" w:space="0"/>
+            <w:insideH w:val="single" w:color="D3D3D3" w:sz="4" w:space="0"/>
+            <w:insideV w:val="none" w:color="auto" w:sz="0" w:space="0"/>
+          </w:tblBorders>
           <w:tblCellMar>
             <w:top w:w="0" w:type="dxa"/>
             <w:left w:w="108" w:type="dxa"/>
@@ -5870,51 +5725,97 @@
         </w:trPr>
         <w:tc>
           <w:tcPr>
-            <w:tcW w:w="9072" w:type="dxa"/>
-            <w:tcBorders>
-              <w:top w:val="nil"/>
-              <w:left w:val="single" w:color="1B365D" w:sz="24" w:space="0"/>
-              <w:bottom w:val="nil"/>
-              <w:right w:val="nil"/>
-            </w:tcBorders>
-            <w:shd w:val="clear" w:color="auto" w:fill="F8F9FA"/>
+            <w:tcW w:w="2592" w:type="dxa"/>
             <w:tcMar>
-              <w:top w:w="140" w:type="dxa"/>
-              <w:left w:w="200" w:type="dxa"/>
-              <w:bottom w:w="140" w:type="dxa"/>
-              <w:right w:w="150" w:type="dxa"/>
+              <w:top w:w="70" w:type="dxa"/>
+              <w:left w:w="70" w:type="dxa"/>
+              <w:bottom w:w="70" w:type="dxa"/>
+              <w:right w:w="70" w:type="dxa"/>
             </w:tcMar>
           </w:tcPr>
           <w:p>
             <w:pPr>
-              <w:spacing w:before="0" w:after="40" w:line="276" w:lineRule="auto"/>
+              <w:spacing w:after="0" w:line="360" w:lineRule="auto"/>
+              <w:jc w:val="left"/>
             </w:pPr>
             <w:r>
               <w:rPr>
-                <w:rFonts w:ascii="Times New Roman" w:hAnsi="Times New Roman"/>
                 <w:b/>
-                <w:color w:val="1B365D"/>
-                <w:sz w:val="22"/>
-              </w:rPr>
-              <w:t>📌 LUẬN ĐIỂM BẢO VỆ TÍCH HỢP AI</w:t>
-            </w:r>
-            <w:r>
-              <w:rPr>
-                <w:rFonts w:ascii="Times New Roman" w:hAnsi="Times New Roman"/>
+                <w:color w:val="2B547E"/>
+                <w:sz w:val="18"/>
+              </w:rPr>
+              <w:t>Thời gian thực thi giải thuật</w:t>
+            </w:r>
+          </w:p>
+        </w:tc>
+        <w:tc>
+          <w:tcPr>
+            <w:tcW w:w="2592" w:type="dxa"/>
+            <w:tcMar>
+              <w:top w:w="70" w:type="dxa"/>
+              <w:left w:w="70" w:type="dxa"/>
+              <w:bottom w:w="70" w:type="dxa"/>
+              <w:right w:w="70" w:type="dxa"/>
+            </w:tcMar>
+          </w:tcPr>
+          <w:p>
+            <w:pPr>
+              <w:spacing w:after="0" w:line="360" w:lineRule="auto"/>
+              <w:jc w:val="left"/>
+            </w:pPr>
+            <w:r>
+              <w:rPr>
+                <w:sz w:val="17"/>
+              </w:rPr>
+              <w:t>97.78 ms</w:t>
+            </w:r>
+          </w:p>
+        </w:tc>
+        <w:tc>
+          <w:tcPr>
+            <w:tcW w:w="2592" w:type="dxa"/>
+            <w:tcMar>
+              <w:top w:w="70" w:type="dxa"/>
+              <w:left w:w="70" w:type="dxa"/>
+              <w:bottom w:w="70" w:type="dxa"/>
+              <w:right w:w="70" w:type="dxa"/>
+            </w:tcMar>
+          </w:tcPr>
+          <w:p>
+            <w:pPr>
+              <w:spacing w:after="0" w:line="360" w:lineRule="auto"/>
+              <w:jc w:val="left"/>
+            </w:pPr>
+            <w:r>
+              <w:rPr>
+                <w:sz w:val="17"/>
+              </w:rPr>
+              <w:t>84.57 ms</w:t>
+            </w:r>
+          </w:p>
+        </w:tc>
+        <w:tc>
+          <w:tcPr>
+            <w:tcW w:w="1584" w:type="dxa"/>
+            <w:tcMar>
+              <w:top w:w="70" w:type="dxa"/>
+              <w:left w:w="70" w:type="dxa"/>
+              <w:bottom w:w="70" w:type="dxa"/>
+              <w:right w:w="70" w:type="dxa"/>
+            </w:tcMar>
+          </w:tcPr>
+          <w:p>
+            <w:pPr>
+              <w:spacing w:after="0" w:line="360" w:lineRule="auto"/>
+              <w:jc w:val="left"/>
+            </w:pPr>
+            <w:r>
+              <w:rPr>
                 <w:b/>
-                <w:color w:val="1B365D"/>
-                <w:sz w:val="22"/>
-              </w:rPr>
-              <w:br w:type="textWrapping"/>
-            </w:r>
-            <w:r>
-              <w:rPr>
-                <w:rFonts w:ascii="Times New Roman" w:hAnsi="Times New Roman"/>
-                <w:i/>
-                <w:color w:val="282828"/>
-                <w:sz w:val="21"/>
-              </w:rPr>
-              <w:t>Luận điểm học thuật then chốt bảo vệ trước Hội đồng: Nếu chỉ sử dụng thuật toán tối ưu hóa lập lịch (OR-Tools) với thời lượng cố định sách vở, kế hoạch phân công rất dễ bị 'vỡ trận' trên thực tế do bệnh nhân nặng mất nhiều thời gian hơn dự kiến, gây hiệu ứng domino làm trễ giờ các ca sau. Mô hình AI dự đoán thời lượng chính là chìa khóa cung cấp đầu vào chuẩn xác, giúp thuật toán OR-Tools phát huy 100% hiệu quả.</w:t>
+                <w:color w:val="008000"/>
+                <w:sz w:val="18"/>
+              </w:rPr>
+              <w:t>Tối ưu tốc độ giải (84.57 ms)</w:t>
             </w:r>
           </w:p>
         </w:tc>
@@ -5922,25 +5823,31 @@
     </w:tbl>
     <w:p>
       <w:pPr>
-        <w:spacing w:after="80"/>
+        <w:spacing w:after="80" w:line="360" w:lineRule="auto"/>
+        <w:jc w:val="left"/>
       </w:pPr>
     </w:p>
     <w:p>
       <w:pPr>
         <w:pStyle w:val="3"/>
-        <w:spacing w:before="160" w:after="80"/>
+        <w:spacing w:before="160" w:after="80" w:line="360" w:lineRule="auto"/>
+        <w:jc w:val="left"/>
       </w:pPr>
       <w:r>
         <w:rPr>
           <w:rFonts w:ascii="Times New Roman" w:hAnsi="Times New Roman"/>
           <w:color w:val="2B547E"/>
         </w:rPr>
-        <w:t>3.7. Báo cáo Kết quả Kiểm thử Tự động (Unit Tests: 24/24 Passed)</w:t>
+        <w:t>3.7. Báo cáo Kết quả Kiểm thử Tự động (Unit Tests: 25/25 Passed)</w:t>
       </w:r>
     </w:p>
     <w:p>
+      <w:pPr>
+        <w:spacing w:line="360" w:lineRule="auto"/>
+        <w:jc w:val="left"/>
+      </w:pPr>
       <w:r>
-        <w:t>Nhằm bảo đảm chất lượng phần mềm theo tiêu chuẩn ngành MIS, toàn bộ 24 test cases đã được thực thi kiểm thử hồi quy tự động qua pytest với kết quả 100% Passed:</w:t>
+        <w:t>Nhằm bảo đảm chất lượng phần mềm theo tiêu chuẩn ngành MIS, toàn bộ 25 test cases đã được thực thi kiểm thử hồi quy tự động qua pytest với kết quả 100% Passed:</w:t>
       </w:r>
     </w:p>
     <w:tbl>
@@ -5990,7 +5897,8 @@
           </w:tcPr>
           <w:p>
             <w:pPr>
-              <w:spacing w:before="0" w:after="0" w:line="252" w:lineRule="auto"/>
+              <w:spacing w:before="0" w:after="0" w:line="360" w:lineRule="auto"/>
+              <w:jc w:val="left"/>
             </w:pPr>
             <w:r>
               <w:rPr>
@@ -6062,7 +5970,7 @@
                 <w:color w:val="1E1E1E"/>
                 <w:sz w:val="18"/>
               </w:rPr>
-              <w:t>collected 24 items</w:t>
+              <w:t>collected 25 items</w:t>
             </w:r>
             <w:r>
               <w:rPr>
@@ -6086,7 +5994,7 @@
                 <w:color w:val="1E1E1E"/>
                 <w:sz w:val="18"/>
               </w:rPr>
-              <w:t>tests/test_ai.py::test_ai_dataset_integrity PASSED                       [  4%]</w:t>
+              <w:t>test_connection.py::test_db PASSED                                       [  4%]</w:t>
             </w:r>
             <w:r>
               <w:rPr>
@@ -6102,7 +6010,7 @@
                 <w:color w:val="1E1E1E"/>
                 <w:sz w:val="18"/>
               </w:rPr>
-              <w:t>tests/test_ai.py::test_ai_model_artifact_load_and_inference PASSED       [  8%]</w:t>
+              <w:t>tests/test_ai.py::test_ai_dataset_integrity PASSED                       [  8%]</w:t>
             </w:r>
             <w:r>
               <w:rPr>
@@ -6118,7 +6026,7 @@
                 <w:color w:val="1E1E1E"/>
                 <w:sz w:val="18"/>
               </w:rPr>
-              <w:t>tests/test_ai.py::test_ai_model_version_registry_in_db PASSED            [ 12%]</w:t>
+              <w:t>tests/test_ai.py::test_ai_model_artifact_load_and_inference PASSED       [ 12%]</w:t>
             </w:r>
             <w:r>
               <w:rPr>
@@ -6134,7 +6042,7 @@
                 <w:color w:val="1E1E1E"/>
                 <w:sz w:val="18"/>
               </w:rPr>
-              <w:t>tests/test_ai.py::test_api_predict_duration_endpoint PASSED              [ 16%]</w:t>
+              <w:t>tests/test_ai.py::test_ai_model_version_registry_in_db PASSED            [ 16%]</w:t>
             </w:r>
             <w:r>
               <w:rPr>
@@ -6150,7 +6058,7 @@
                 <w:color w:val="1E1E1E"/>
                 <w:sz w:val="18"/>
               </w:rPr>
-              <w:t>tests/test_ai.py::test_api_ai_models_comparison_endpoint PASSED          [ 20%]</w:t>
+              <w:t>tests/test_ai.py::test_api_predict_duration_endpoint PASSED              [ 20%]</w:t>
             </w:r>
             <w:r>
               <w:rPr>
@@ -6166,7 +6074,7 @@
                 <w:color w:val="1E1E1E"/>
                 <w:sz w:val="18"/>
               </w:rPr>
-              <w:t>tests/test_ai.py::test_safe_fallback_mechanism PASSED                    [ 25%]</w:t>
+              <w:t>tests/test_ai.py::test_api_ai_models_comparison_endpoint PASSED          [ 24%]</w:t>
             </w:r>
             <w:r>
               <w:rPr>
@@ -6182,7 +6090,7 @@
                 <w:color w:val="1E1E1E"/>
                 <w:sz w:val="18"/>
               </w:rPr>
-              <w:t>tests/test_api.py::test_health_check PASSED                              [ 29%]</w:t>
+              <w:t>tests/test_ai.py::test_safe_fallback_mechanism PASSED                    [ 28%]</w:t>
             </w:r>
             <w:r>
               <w:rPr>
@@ -6198,7 +6106,7 @@
                 <w:color w:val="1E1E1E"/>
                 <w:sz w:val="18"/>
               </w:rPr>
-              <w:t>tests/test_api.py::test_auth_login_success PASSED                        [ 33%]</w:t>
+              <w:t>tests/test_api.py::test_health_check PASSED                              [ 32%]</w:t>
             </w:r>
             <w:r>
               <w:rPr>
@@ -6214,7 +6122,7 @@
                 <w:color w:val="1E1E1E"/>
                 <w:sz w:val="18"/>
               </w:rPr>
-              <w:t>tests/test_api.py::test_auth_login_invalid_password PASSED               [ 37%]</w:t>
+              <w:t>tests/test_api.py::test_auth_login_success PASSED                        [ 36%]</w:t>
             </w:r>
             <w:r>
               <w:rPr>
@@ -6230,7 +6138,7 @@
                 <w:color w:val="1E1E1E"/>
                 <w:sz w:val="18"/>
               </w:rPr>
-              <w:t>tests/test_api.py::test_get_customers_and_employees PASSED               [ 41%]</w:t>
+              <w:t>tests/test_api.py::test_auth_login_invalid_password PASSED               [ 40%]</w:t>
             </w:r>
             <w:r>
               <w:rPr>
@@ -6246,7 +6154,7 @@
                 <w:color w:val="1E1E1E"/>
                 <w:sz w:val="18"/>
               </w:rPr>
-              <w:t>tests/test_api.py::test_get_services_and_skills PASSED                   [ 45%]</w:t>
+              <w:t>tests/test_api.py::test_get_customers_and_employees PASSED               [ 44%]</w:t>
             </w:r>
             <w:r>
               <w:rPr>
@@ -6262,7 +6170,7 @@
                 <w:color w:val="1E1E1E"/>
                 <w:sz w:val="18"/>
               </w:rPr>
-              <w:t>tests/test_api.py::test_end_to_end_request_assignment_result_flow PASSED [ 50%]</w:t>
+              <w:t>tests/test_api.py::test_get_services_and_skills PASSED                   [ 48%]</w:t>
             </w:r>
             <w:r>
               <w:rPr>
@@ -6278,7 +6186,7 @@
                 <w:color w:val="1E1E1E"/>
                 <w:sz w:val="18"/>
               </w:rPr>
-              <w:t>tests/test_constraints.py::test_hard_constraint_1_skill_matching PASSED  [ 54%]</w:t>
+              <w:t>tests/test_api.py::test_end_to_end_request_assignment_result_flow PASSED [ 52%]</w:t>
             </w:r>
             <w:r>
               <w:rPr>
@@ -6294,7 +6202,7 @@
                 <w:color w:val="1E1E1E"/>
                 <w:sz w:val="18"/>
               </w:rPr>
-              <w:t>tests/test_constraints.py::test_hard_constraint_2_active_status PASSED   [ 58%]</w:t>
+              <w:t>tests/test_constraints.py::test_hard_constraint_1_skill_matching PASSED  [ 56%]</w:t>
             </w:r>
             <w:r>
               <w:rPr>
@@ -6310,7 +6218,7 @@
                 <w:color w:val="1E1E1E"/>
                 <w:sz w:val="18"/>
               </w:rPr>
-              <w:t>tests/test_constraints.py::test_hard_constraint_3_availability PASSED    [ 62%]</w:t>
+              <w:t>tests/test_constraints.py::test_hard_constraint_2_active_status PASSED   [ 60%]</w:t>
             </w:r>
             <w:r>
               <w:rPr>
@@ -6326,7 +6234,7 @@
                 <w:color w:val="1E1E1E"/>
                 <w:sz w:val="18"/>
               </w:rPr>
-              <w:t>tests/test_constraints.py::test_hard_constraint_4_no_schedule_overlap PASSED [ 66%]</w:t>
+              <w:t>tests/test_constraints.py::test_hard_constraint_3_availability PASSED    [ 64%]</w:t>
             </w:r>
             <w:r>
               <w:rPr>
@@ -6342,7 +6250,7 @@
                 <w:color w:val="1E1E1E"/>
                 <w:sz w:val="18"/>
               </w:rPr>
-              <w:t>tests/test_constraints.py::test_hard_constraint_5_travel_feasibility PASSED [ 70%]</w:t>
+              <w:t>tests/test_constraints.py::test_hard_constraint_4_no_schedule_overlap PASSED [ 68%]</w:t>
             </w:r>
             <w:r>
               <w:rPr>
@@ -6358,7 +6266,7 @@
                 <w:color w:val="1E1E1E"/>
                 <w:sz w:val="18"/>
               </w:rPr>
-              <w:t>tests/test_constraints.py::test_hard_constraint_6_daily_workload_limit PASSED [ 75%]</w:t>
+              <w:t>tests/test_constraints.py::test_hard_constraint_5_travel_feasibility PASSED [ 72%]</w:t>
             </w:r>
             <w:r>
               <w:rPr>
@@ -6374,7 +6282,7 @@
                 <w:color w:val="1E1E1E"/>
                 <w:sz w:val="18"/>
               </w:rPr>
-              <w:t>tests/test_constraints.py::test_state_transitions PASSED                 [ 79%]</w:t>
+              <w:t>tests/test_constraints.py::test_hard_constraint_6_daily_workload_limit PASSED [ 76%]</w:t>
             </w:r>
             <w:r>
               <w:rPr>
@@ -6390,7 +6298,7 @@
                 <w:color w:val="1E1E1E"/>
                 <w:sz w:val="18"/>
               </w:rPr>
-              <w:t>tests/test_scheduling.py::test_dss_scoring_computation PASSED            [ 83%]</w:t>
+              <w:t>tests/test_constraints.py::test_state_transitions PASSED                 [ 80%]</w:t>
             </w:r>
             <w:r>
               <w:rPr>
@@ -6406,7 +6314,7 @@
                 <w:color w:val="1E1E1E"/>
                 <w:sz w:val="18"/>
               </w:rPr>
-              <w:t>tests/test_scheduling.py::test_recommend_candidates_api PASSED           [ 87%]</w:t>
+              <w:t>tests/test_end_to_end_flow.py::test_complete_phase_f_closed_loop_workflow PASSED [ 84%]</w:t>
             </w:r>
             <w:r>
               <w:rPr>
@@ -6422,7 +6330,7 @@
                 <w:color w:val="1E1E1E"/>
                 <w:sz w:val="18"/>
               </w:rPr>
-              <w:t>tests/test_scheduling.py::test_realtime_feasibility_check_api PASSED     [ 91%]</w:t>
+              <w:t>tests/test_scheduling.py::test_dss_scoring_computation PASSED            [ 88%]</w:t>
             </w:r>
             <w:r>
               <w:rPr>
@@ -6438,7 +6346,7 @@
                 <w:color w:val="1E1E1E"/>
                 <w:sz w:val="18"/>
               </w:rPr>
-              <w:t>tests/test_scheduling.py::test_ortools_global_schedule_optimization PASSED [ 95%]</w:t>
+              <w:t>tests/test_scheduling.py::test_recommend_candidates_api PASSED           [ 92%]</w:t>
             </w:r>
             <w:r>
               <w:rPr>
@@ -6454,7 +6362,7 @@
                 <w:color w:val="1E1E1E"/>
                 <w:sz w:val="18"/>
               </w:rPr>
-              <w:t>tests/test_end_to_end_flow.py::test_complete_8_step_workflow PASSED     [100%]</w:t>
+              <w:t>tests/test_scheduling.py::test_realtime_feasibility_check_api PASSED     [ 96%]</w:t>
             </w:r>
             <w:r>
               <w:rPr>
@@ -6470,7 +6378,7 @@
                 <w:color w:val="1E1E1E"/>
                 <w:sz w:val="18"/>
               </w:rPr>
-              <w:br w:type="textWrapping"/>
+              <w:t>tests/test_scheduling.py::test_ortools_global_schedule_optimization PASSED [100%]</w:t>
             </w:r>
             <w:r>
               <w:rPr>
@@ -6478,7 +6386,23 @@
                 <w:color w:val="1E1E1E"/>
                 <w:sz w:val="18"/>
               </w:rPr>
-              <w:t>======================== 24 passed in 4.24s ========================</w:t>
+              <w:br w:type="textWrapping"/>
+            </w:r>
+            <w:r>
+              <w:rPr>
+                <w:rFonts w:ascii="Consolas" w:hAnsi="Consolas"/>
+                <w:color w:val="1E1E1E"/>
+                <w:sz w:val="18"/>
+              </w:rPr>
+              <w:br w:type="textWrapping"/>
+            </w:r>
+            <w:r>
+              <w:rPr>
+                <w:rFonts w:ascii="Consolas" w:hAnsi="Consolas"/>
+                <w:color w:val="1E1E1E"/>
+                <w:sz w:val="18"/>
+              </w:rPr>
+              <w:t>======================== 25 passed, 2 warnings in 5.97s ========================</w:t>
             </w:r>
           </w:p>
         </w:tc>
@@ -6486,142 +6410,15 @@
     </w:tbl>
     <w:p>
       <w:pPr>
-        <w:spacing w:after="80"/>
+        <w:spacing w:after="80" w:line="360" w:lineRule="auto"/>
+        <w:jc w:val="left"/>
       </w:pPr>
     </w:p>
     <w:p>
       <w:pPr>
-        <w:pStyle w:val="2"/>
-        <w:spacing w:before="280" w:after="120"/>
+        <w:spacing w:after="40" w:line="360" w:lineRule="auto"/>
+        <w:jc w:val="left"/>
       </w:pPr>
-      <w:r>
-        <w:rPr>
-          <w:rFonts w:ascii="Times New Roman" w:hAnsi="Times New Roman"/>
-          <w:color w:val="1B365D"/>
-        </w:rPr>
-        <w:t>IV. KẾ HOẠCH TRIỂN KHAI ĐỢT 3 (GIAI ĐOẠN G: FRONTEND &amp; HOÀN THIỆN)</w:t>
-      </w:r>
-    </w:p>
-    <w:p>
-      <w:r>
-        <w:t>Sau khi được Cô thông qua báo cáo tiến độ Đợt 2, em sẽ tiến hành ngay Giai đoạn G với 3 trọng tâm sau:</w:t>
-      </w:r>
-      <w:r>
-        <w:br w:type="textWrapping"/>
-      </w:r>
-      <w:r>
-        <w:t>1. Xây dựng ứng dụng Web Frontend hiện đại: Sử dụng React + Vite + TypeScript kết hợp bộ giao diện Ant Design và bản đồ Leaflet Map.</w:t>
-      </w:r>
-      <w:r>
-        <w:br w:type="textWrapping"/>
-      </w:r>
-      <w:r>
-        <w:t>2. Hiện thực hóa 5 màn hình tương tác cốt lõi theo Mục 13 của đề cương:</w:t>
-      </w:r>
-      <w:r>
-        <w:br w:type="textWrapping"/>
-      </w:r>
-      <w:r>
-        <w:t xml:space="preserve">   • Màn hình Tiếp nhận ca &amp; Gợi ý AI (AI Recommendation): Hiển thị thời lượng AI dự đoán, danh sách Top-K nhân sự phù hợp, chi tiết điểm số từng tiêu chí và nút xác nhận phân công kèm lý do Override.</w:t>
-      </w:r>
-      <w:r>
-        <w:br w:type="textWrapping"/>
-      </w:r>
-      <w:r>
-        <w:t xml:space="preserve">   • Màn hình Bàn điều phối lịch biểu (Dispatch Board / Calendar): Trực quan hóa lịch trực theo ngày/tuần của từng điều dưỡng viên tại TP. Nha Trang.</w:t>
-      </w:r>
-      <w:r>
-        <w:br w:type="textWrapping"/>
-      </w:r>
-      <w:r>
-        <w:t xml:space="preserve">   • Màn hình Tối ưu hóa điều phối toàn ngày (OR-Tools Dashboard): Nút bấm kích hoạt solver OR-Tools tự động xếp lịch đồng loạt và hiển thị bảng so sánh KPI trước/sau tối ưu.</w:t>
-      </w:r>
-      <w:r>
-        <w:br w:type="textWrapping"/>
-      </w:r>
-      <w:r>
-        <w:t xml:space="preserve">   • Màn hình Bản đồ số GIS (Leaflet Map): Định vị vị trí bệnh nhân và lộ trình di chuyển của điều dưỡng viên.</w:t>
-      </w:r>
-      <w:r>
-        <w:br w:type="textWrapping"/>
-      </w:r>
-      <w:r>
-        <w:t xml:space="preserve">   • Màn hình Báo cáo Quản trị (Dashboard KPI): Thống kê tỷ lệ ca hoàn thành, đánh giá sự hài lòng và độ chính xác của mô hình AI.</w:t>
-      </w:r>
-      <w:r>
-        <w:br w:type="textWrapping"/>
-      </w:r>
-      <w:r>
-        <w:t>3. Đóng gói hệ thống &amp; Viết thuyết minh tốt nghiệp: Đóng gói toàn bộ ứng dụng bằng Docker Compose (Database + Backend + Frontend), hoàn thiện bản thuyết minh luận văn (Chương 1 đến Chương 5) và chuẩn bị slide bảo vệ trước Hội đồng.</w:t>
-      </w:r>
-    </w:p>
-    <w:p>
-      <w:pPr>
-        <w:spacing w:after="320"/>
-      </w:pPr>
-    </w:p>
-    <w:p>
-      <w:pPr>
-        <w:spacing w:after="40"/>
-        <w:jc w:val="right"/>
-      </w:pPr>
-      <w:r>
-        <w:rPr>
-          <w:i/>
-          <w:sz w:val="22"/>
-        </w:rPr>
-        <w:t>Nha Trang, ngày 16 tháng 10 năm 2026</w:t>
-      </w:r>
-      <w:r>
-        <w:rPr>
-          <w:i/>
-          <w:sz w:val="22"/>
-        </w:rPr>
-        <w:br w:type="textWrapping"/>
-      </w:r>
-      <w:r>
-        <w:rPr>
-          <w:b/>
-          <w:sz w:val="22"/>
-        </w:rPr>
-        <w:t>Sinh viên thực hiện</w:t>
-      </w:r>
-      <w:r>
-        <w:rPr>
-          <w:b/>
-          <w:sz w:val="22"/>
-        </w:rPr>
-        <w:br w:type="textWrapping"/>
-      </w:r>
-      <w:r>
-        <w:rPr>
-          <w:b/>
-          <w:sz w:val="22"/>
-        </w:rPr>
-        <w:br w:type="textWrapping"/>
-      </w:r>
-      <w:r>
-        <w:rPr>
-          <w:b/>
-          <w:sz w:val="22"/>
-        </w:rPr>
-        <w:br w:type="textWrapping"/>
-      </w:r>
-      <w:r>
-        <w:rPr>
-          <w:b/>
-          <w:sz w:val="22"/>
-        </w:rPr>
-        <w:br w:type="textWrapping"/>
-      </w:r>
-      <w:r>
-        <w:rPr>
-          <w:b/>
-          <w:color w:val="1B365D"/>
-          <w:sz w:val="24"/>
-        </w:rPr>
-        <w:t>Nguyễn Thạch Thảo</w:t>
-      </w:r>
     </w:p>
     <w:sectPr>
       <w:headerReference r:id="rId5" w:type="default"/>
@@ -6870,7 +6667,7 @@
   <w:docDefaults>
     <w:rPrDefault>
       <w:rPr>
-        <w:rFonts w:asciiTheme="minorHAnsi" w:hAnsiTheme="minorHAnsi" w:eastAsiaTheme="minorEastAsia" w:cstheme="minorBidi"/>
+        <w:rFonts w:ascii="Times New Roman" w:hAnsi="Times New Roman" w:eastAsia="SimSun" w:cs="Times New Roman"/>
       </w:rPr>
     </w:rPrDefault>
     <w:pPrDefault/>
@@ -6941,7 +6738,7 @@
     <w:lsdException w:qFormat="1" w:unhideWhenUsed="0" w:uiPriority="10" w:semiHidden="0" w:name="Title"/>
     <w:lsdException w:uiPriority="99" w:name="Closing"/>
     <w:lsdException w:uiPriority="99" w:name="Signature"/>
-    <w:lsdException w:uiPriority="1" w:name="Default Paragraph Font"/>
+    <w:lsdException w:qFormat="1" w:uiPriority="1" w:name="Default Paragraph Font"/>
     <w:lsdException w:uiPriority="99" w:semiHidden="0" w:name="Body Text"/>
     <w:lsdException w:uiPriority="99" w:name="Body Text Indent"/>
     <w:lsdException w:uiPriority="99" w:semiHidden="0" w:name="List Continue"/>
@@ -6979,7 +6776,7 @@
     <w:lsdException w:uiPriority="99" w:name="HTML Sample"/>
     <w:lsdException w:uiPriority="99" w:name="HTML Typewriter"/>
     <w:lsdException w:uiPriority="99" w:name="HTML Variable"/>
-    <w:lsdException w:uiPriority="99" w:name="Normal Table"/>
+    <w:lsdException w:qFormat="1" w:uiPriority="99" w:name="Normal Table"/>
     <w:lsdException w:uiPriority="99" w:name="annotation subject"/>
     <w:lsdException w:uiPriority="99" w:name="Table Simple 1"/>
     <w:lsdException w:uiPriority="99" w:name="Table Simple 2"/>
@@ -7041,7 +6838,7 @@
     <w:lsdException w:unhideWhenUsed="0" w:uiPriority="71" w:semiHidden="0" w:name="Colorful Shading"/>
     <w:lsdException w:unhideWhenUsed="0" w:uiPriority="72" w:semiHidden="0" w:name="Colorful List"/>
     <w:lsdException w:unhideWhenUsed="0" w:uiPriority="73" w:semiHidden="0" w:name="Colorful Grid"/>
-    <w:lsdException w:unhideWhenUsed="0" w:uiPriority="60" w:semiHidden="0" w:name="Light Shading Accent 1"/>
+    <w:lsdException w:qFormat="1" w:unhideWhenUsed="0" w:uiPriority="60" w:semiHidden="0" w:name="Light Shading Accent 1"/>
     <w:lsdException w:unhideWhenUsed="0" w:uiPriority="61" w:semiHidden="0" w:name="Light List Accent 1"/>
     <w:lsdException w:unhideWhenUsed="0" w:uiPriority="62" w:semiHidden="0" w:name="Light Grid Accent 1"/>
     <w:lsdException w:unhideWhenUsed="0" w:uiPriority="63" w:semiHidden="0" w:name="Medium Shading 1 Accent 1"/>
@@ -7058,7 +6855,7 @@
     <w:lsdException w:unhideWhenUsed="0" w:uiPriority="71" w:semiHidden="0" w:name="Colorful Shading Accent 1"/>
     <w:lsdException w:unhideWhenUsed="0" w:uiPriority="72" w:semiHidden="0" w:name="Colorful List Accent 1"/>
     <w:lsdException w:unhideWhenUsed="0" w:uiPriority="73" w:semiHidden="0" w:name="Colorful Grid Accent 1"/>
-    <w:lsdException w:unhideWhenUsed="0" w:uiPriority="60" w:semiHidden="0" w:name="Light Shading Accent 2"/>
+    <w:lsdException w:qFormat="1" w:unhideWhenUsed="0" w:uiPriority="60" w:semiHidden="0" w:name="Light Shading Accent 2"/>
     <w:lsdException w:unhideWhenUsed="0" w:uiPriority="61" w:semiHidden="0" w:name="Light List Accent 2"/>
     <w:lsdException w:unhideWhenUsed="0" w:uiPriority="62" w:semiHidden="0" w:name="Light Grid Accent 2"/>
     <w:lsdException w:unhideWhenUsed="0" w:uiPriority="63" w:semiHidden="0" w:name="Medium Shading 1 Accent 2"/>
@@ -7100,7 +6897,7 @@
     <w:lsdException w:unhideWhenUsed="0" w:uiPriority="71" w:semiHidden="0" w:name="Colorful Shading Accent 4"/>
     <w:lsdException w:unhideWhenUsed="0" w:uiPriority="72" w:semiHidden="0" w:name="Colorful List Accent 4"/>
     <w:lsdException w:unhideWhenUsed="0" w:uiPriority="73" w:semiHidden="0" w:name="Colorful Grid Accent 4"/>
-    <w:lsdException w:unhideWhenUsed="0" w:uiPriority="60" w:semiHidden="0" w:name="Light Shading Accent 5"/>
+    <w:lsdException w:qFormat="1" w:unhideWhenUsed="0" w:uiPriority="60" w:semiHidden="0" w:name="Light Shading Accent 5"/>
     <w:lsdException w:unhideWhenUsed="0" w:uiPriority="61" w:semiHidden="0" w:name="Light List Accent 5"/>
     <w:lsdException w:unhideWhenUsed="0" w:uiPriority="62" w:semiHidden="0" w:name="Light Grid Accent 5"/>
     <w:lsdException w:unhideWhenUsed="0" w:uiPriority="63" w:semiHidden="0" w:name="Medium Shading 1 Accent 5"/>
@@ -7385,12 +7182,14 @@
     <w:name w:val="Default Paragraph Font"/>
     <w:semiHidden/>
     <w:unhideWhenUsed/>
+    <w:qFormat/>
     <w:uiPriority w:val="1"/>
   </w:style>
   <w:style w:type="table" w:default="1" w:styleId="12">
     <w:name w:val="Normal Table"/>
     <w:semiHidden/>
     <w:unhideWhenUsed/>
+    <w:qFormat/>
     <w:uiPriority w:val="99"/>
     <w:tblPr>
       <w:tblCellMar>
@@ -7845,6 +7644,7 @@
   <w:style w:type="table" w:styleId="38">
     <w:name w:val="Light Shading Accent 1"/>
     <w:basedOn w:val="12"/>
+    <w:qFormat/>
     <w:uiPriority w:val="60"/>
     <w:pPr>
       <w:spacing w:after="0" w:line="240" w:lineRule="auto"/>
@@ -7944,6 +7744,7 @@
   <w:style w:type="table" w:styleId="39">
     <w:name w:val="Light Shading Accent 2"/>
     <w:basedOn w:val="12"/>
+    <w:qFormat/>
     <w:uiPriority w:val="60"/>
     <w:pPr>
       <w:spacing w:after="0" w:line="240" w:lineRule="auto"/>
@@ -8241,6 +8042,7 @@
   <w:style w:type="table" w:styleId="42">
     <w:name w:val="Light Shading Accent 5"/>
     <w:basedOn w:val="12"/>
+    <w:qFormat/>
     <w:uiPriority w:val="60"/>
     <w:pPr>
       <w:spacing w:after="0" w:line="240" w:lineRule="auto"/>
@@ -19151,7 +18953,6 @@
     <w:name w:val="Header Char"/>
     <w:basedOn w:val="11"/>
     <w:link w:val="19"/>
-    <w:qFormat/>
     <w:uiPriority w:val="99"/>
   </w:style>
   <w:style w:type="character" w:customStyle="1" w:styleId="136">
@@ -19193,6 +18994,7 @@
     <w:name w:val="Heading 2 Char"/>
     <w:basedOn w:val="11"/>
     <w:link w:val="3"/>
+    <w:qFormat/>
     <w:uiPriority w:val="9"/>
     <w:rPr>
       <w:rFonts w:asciiTheme="majorHAnsi" w:hAnsiTheme="majorHAnsi" w:eastAsiaTheme="majorEastAsia" w:cstheme="majorBidi"/>
@@ -19285,6 +19087,7 @@
     <w:name w:val="Body Text 3 Char"/>
     <w:basedOn w:val="11"/>
     <w:link w:val="15"/>
+    <w:qFormat/>
     <w:uiPriority w:val="99"/>
     <w:rPr>
       <w:sz w:val="16"/>

</xml_diff>